<commit_message>
Dự thảo HĐ phần thân: chỉnh phạt theo phần nghĩa vụ vi phạm, bất khả kháng theo BLDS, tạm ứng theo NĐ 210/2026, bổ sung gia hạn và thủ tục khiếu nại
Co-Authored-By: Claude Opus 5.5 <noreply@anthropic.com>
Claude-Session: https://claude.ai/code/session_019QLSuLC1cpcB21GuuDYzS7
</commit_message>
<xml_diff>
--- a/3. DỰ THẢO HĐ/HĐ NOXH YÊN SỞ - PHẦN THÂN.docx
+++ b/3. DỰ THẢO HĐ/HĐ NOXH YÊN SỞ - PHẦN THÂN.docx
@@ -3335,6 +3335,21 @@
     <w:p>
       <w:pPr>
         <w:spacing w:after="60" w:before="60" w:line="300"/>
+        <w:ind w:left="567"/>
+        <w:jc w:val="both"/>
+      </w:pPr>
+      <w:r>
+        <w:rPr>
+          <w:rFonts w:ascii="Times New Roman" w:cs="Times New Roman" w:eastAsia="Times New Roman" w:hAnsi="Times New Roman"/>
+          <w:sz w:val="26"/>
+          <w:szCs w:val="26"/>
+        </w:rPr>
+        <w:t xml:space="preserve">d) Trường hợp kết quả thí nghiệm mẫu bê tông không đạt yêu cầu, Bên B chịu toàn bộ chi phí kiểm định bổ sung (khoan lấy lõi, siêu âm, bật nẩy, thử tải…), chi phí thiết kế, gia cường hoặc phá dỡ, làm lại theo kết luận của Tư vấn thiết kế, trừ trường hợp chứng minh được nguyên nhân do bê tông Bên A cấp không đạt chất lượng tại thời điểm giao nhận.</w:t>
+      </w:r>
+    </w:p>
+    <w:p>
+      <w:pPr>
+        <w:spacing w:after="60" w:before="60" w:line="300"/>
         <w:ind w:firstLine="567"/>
         <w:jc w:val="both"/>
       </w:pPr>
@@ -3618,7 +3633,22 @@
           <w:sz w:val="26"/>
           <w:szCs w:val="26"/>
         </w:rPr>
-        <w:t xml:space="preserve">d) Việc kiểm tra, nghiệm thu của Bên A không thay thế hoặc làm giảm bất kỳ nghĩa vụ nào của Bên B theo Hợp đồng.</w:t>
+        <w:t xml:space="preserve">d) Trước khi chuyển sang thi công hoàn thiện cho từng tầng/khối, Bên B phải hoàn thành nghiệm thu giai đoạn kết cấu Phần thân (có Chủ đầu tư, Tư vấn giám sát tham gia) theo quy định về quản lý chất lượng công trình xây dựng.</w:t>
+      </w:r>
+    </w:p>
+    <w:p>
+      <w:pPr>
+        <w:spacing w:after="60" w:before="60" w:line="300"/>
+        <w:ind w:left="567"/>
+        <w:jc w:val="both"/>
+      </w:pPr>
+      <w:r>
+        <w:rPr>
+          <w:rFonts w:ascii="Times New Roman" w:cs="Times New Roman" w:eastAsia="Times New Roman" w:hAnsi="Times New Roman"/>
+          <w:sz w:val="26"/>
+          <w:szCs w:val="26"/>
+        </w:rPr>
+        <w:t xml:space="preserve">e) Việc kiểm tra, nghiệm thu của Bên A không thay thế hoặc làm giảm bất kỳ nghĩa vụ nào của Bên B theo Hợp đồng.</w:t>
       </w:r>
     </w:p>
     <w:p>
@@ -4124,7 +4154,40 @@
           <w:sz w:val="26"/>
           <w:szCs w:val="26"/>
         </w:rPr>
-        <w:t xml:space="preserve">7.3. Hậu quả của việc chậm tiến độ</w:t>
+        <w:t xml:space="preserve">7.3. Gia hạn thời gian hoàn thành</w:t>
+      </w:r>
+    </w:p>
+    <w:p>
+      <w:pPr>
+        <w:spacing w:after="60" w:before="60" w:line="300"/>
+        <w:ind w:firstLine="567"/>
+        <w:jc w:val="both"/>
+      </w:pPr>
+      <w:r>
+        <w:rPr>
+          <w:rFonts w:ascii="Times New Roman" w:cs="Times New Roman" w:eastAsia="Times New Roman" w:hAnsi="Times New Roman"/>
+          <w:sz w:val="26"/>
+          <w:szCs w:val="26"/>
+        </w:rPr>
+        <w:t xml:space="preserve">Bên B chỉ được xem xét gia hạn thời gian hoàn thành trong các trường hợp: (i) Bên A chậm bàn giao mặt bằng, chậm cấp vật tư theo Điều 14 hoặc chậm cung cấp bản vẽ thi công so với tiến độ đã thống nhất; (ii) công việc phát sinh, thay đổi theo Điều 13 làm kéo dài đường găng tiến độ; (iii) tạm dừng theo điểm a(ii) Khoản 17.1; (iv) sự kiện bất khả kháng theo Điều 16. Việc gia hạn chỉ tương ứng với thời gian bị ảnh hưởng trực tiếp đến đường găng, phải được đề nghị theo thủ tục tại Khoản 13.4 và không vượt quá thời gian Bên A được Chủ đầu tư gia hạn tương ứng (trừ trường hợp do lỗi của Bên A).</w:t>
+      </w:r>
+    </w:p>
+    <w:p>
+      <w:pPr>
+        <w:keepNext/>
+        <w:spacing w:after="60" w:before="60" w:line="300"/>
+        <w:ind w:firstLine="567"/>
+        <w:jc w:val="both"/>
+      </w:pPr>
+      <w:r>
+        <w:rPr>
+          <w:rFonts w:ascii="Times New Roman" w:cs="Times New Roman" w:eastAsia="Times New Roman" w:hAnsi="Times New Roman"/>
+          <w:b/>
+          <w:bCs/>
+          <w:sz w:val="26"/>
+          <w:szCs w:val="26"/>
+        </w:rPr>
+        <w:t xml:space="preserve">7.4. Hậu quả của việc chậm tiến độ</w:t>
       </w:r>
     </w:p>
     <w:p>
@@ -4916,7 +4979,37 @@
           <w:sz w:val="26"/>
           <w:szCs w:val="26"/>
         </w:rPr>
-        <w:t xml:space="preserve">- Biên bản xác nhận nhân lực, thiết bị, hệ ván khuôn, giàn giáo đã tập kết về Công trường được Bên A xác nhận.</w:t>
+        <w:t xml:space="preserve">- Biên bản xác nhận nhân lực, thiết bị, hệ ván khuôn, giàn giáo đã tập kết về Công trường được Bên A xác nhận;</w:t>
+      </w:r>
+    </w:p>
+    <w:p>
+      <w:pPr>
+        <w:spacing w:after="60" w:before="60" w:line="300"/>
+        <w:ind w:left="1134"/>
+        <w:jc w:val="both"/>
+      </w:pPr>
+      <w:r>
+        <w:rPr>
+          <w:rFonts w:ascii="Times New Roman" w:cs="Times New Roman" w:eastAsia="Times New Roman" w:hAnsi="Times New Roman"/>
+          <w:sz w:val="26"/>
+          <w:szCs w:val="26"/>
+        </w:rPr>
+        <w:t xml:space="preserve">- Biên bản bàn giao mặt bằng (hoặc kế hoạch bàn giao mặt bằng) thi công Phần thân.</w:t>
+      </w:r>
+    </w:p>
+    <w:p>
+      <w:pPr>
+        <w:spacing w:after="60" w:before="60" w:line="300"/>
+        <w:ind w:firstLine="567"/>
+        <w:jc w:val="both"/>
+      </w:pPr>
+      <w:r>
+        <w:rPr>
+          <w:rFonts w:ascii="Times New Roman" w:cs="Times New Roman" w:eastAsia="Times New Roman" w:hAnsi="Times New Roman"/>
+          <w:sz w:val="26"/>
+          <w:szCs w:val="26"/>
+        </w:rPr>
+        <w:t xml:space="preserve">Mức tạm ứng không vượt quá mức tối đa theo Nghị định số 210/2026/NĐ-CP. Giá trị bảo lãnh tạm ứng được giảm dần tương ứng với giá trị tạm ứng đã thu hồi qua các lần thanh toán.</w:t>
       </w:r>
     </w:p>
     <w:p>
@@ -5554,7 +5647,7 @@
           <w:sz w:val="26"/>
           <w:szCs w:val="26"/>
         </w:rPr>
-        <w:t xml:space="preserve">c) Thời hạn thanh toán tiền giữ lại bảo hành: trong vòng </w:t>
+        <w:t xml:space="preserve">c) Ngoài trường hợp quy định tại điểm b Khoản này, nếu Bên A chậm thanh toán quá thời hạn quy định mà không có lý do chính đáng thì phải trả lãi trên số tiền chậm trả theo lãi suất </w:t>
       </w:r>
       <w:r>
         <w:rPr>
@@ -5572,6 +5665,57 @@
           <w:sz w:val="26"/>
           <w:szCs w:val="26"/>
         </w:rPr>
+        <w:t xml:space="preserve">%/năm, tính từ ngày thứ </w:t>
+      </w:r>
+      <w:r>
+        <w:rPr>
+          <w:rFonts w:ascii="Times New Roman" w:cs="Times New Roman" w:eastAsia="Times New Roman" w:hAnsi="Times New Roman"/>
+          <w:sz w:val="26"/>
+          <w:szCs w:val="26"/>
+          <w:highlight w:val="yellow"/>
+          <w:highlightCs w:val="yellow"/>
+        </w:rPr>
+        <w:t xml:space="preserve">……</w:t>
+      </w:r>
+      <w:r>
+        <w:rPr>
+          <w:rFonts w:ascii="Times New Roman" w:cs="Times New Roman" w:eastAsia="Times New Roman" w:hAnsi="Times New Roman"/>
+          <w:sz w:val="26"/>
+          <w:szCs w:val="26"/>
+        </w:rPr>
+        <w:t xml:space="preserve"> sau ngày đến hạn.</w:t>
+      </w:r>
+    </w:p>
+    <w:p>
+      <w:pPr>
+        <w:spacing w:after="60" w:before="60" w:line="300"/>
+        <w:ind w:left="567"/>
+        <w:jc w:val="both"/>
+      </w:pPr>
+      <w:r>
+        <w:rPr>
+          <w:rFonts w:ascii="Times New Roman" w:cs="Times New Roman" w:eastAsia="Times New Roman" w:hAnsi="Times New Roman"/>
+          <w:sz w:val="26"/>
+          <w:szCs w:val="26"/>
+        </w:rPr>
+        <w:t xml:space="preserve">d) Thời hạn thanh toán tiền giữ lại bảo hành: trong vòng </w:t>
+      </w:r>
+      <w:r>
+        <w:rPr>
+          <w:rFonts w:ascii="Times New Roman" w:cs="Times New Roman" w:eastAsia="Times New Roman" w:hAnsi="Times New Roman"/>
+          <w:sz w:val="26"/>
+          <w:szCs w:val="26"/>
+          <w:highlight w:val="yellow"/>
+          <w:highlightCs w:val="yellow"/>
+        </w:rPr>
+        <w:t xml:space="preserve">……</w:t>
+      </w:r>
+      <w:r>
+        <w:rPr>
+          <w:rFonts w:ascii="Times New Roman" w:cs="Times New Roman" w:eastAsia="Times New Roman" w:hAnsi="Times New Roman"/>
+          <w:sz w:val="26"/>
+          <w:szCs w:val="26"/>
+        </w:rPr>
         <w:t xml:space="preserve"> ngày làm việc kể từ ngày Bên A nhận được đầy đủ hồ sơ hợp lệ theo Khoản 10.6.</w:t>
       </w:r>
     </w:p>
@@ -7360,6 +7504,123 @@
     <w:p>
       <w:pPr>
         <w:keepNext/>
+        <w:spacing w:after="60" w:before="60" w:line="300"/>
+        <w:ind w:firstLine="567"/>
+        <w:jc w:val="both"/>
+      </w:pPr>
+      <w:r>
+        <w:rPr>
+          <w:rFonts w:ascii="Times New Roman" w:cs="Times New Roman" w:eastAsia="Times New Roman" w:hAnsi="Times New Roman"/>
+          <w:b/>
+          <w:bCs/>
+          <w:sz w:val="26"/>
+          <w:szCs w:val="26"/>
+        </w:rPr>
+        <w:t xml:space="preserve">13.4. Thủ tục khiếu nại (yêu cầu gia hạn thời gian, thanh toán bổ sung)</w:t>
+      </w:r>
+    </w:p>
+    <w:p>
+      <w:pPr>
+        <w:spacing w:after="60" w:before="60" w:line="300"/>
+        <w:ind w:left="567"/>
+        <w:jc w:val="both"/>
+      </w:pPr>
+      <w:r>
+        <w:rPr>
+          <w:rFonts w:ascii="Times New Roman" w:cs="Times New Roman" w:eastAsia="Times New Roman" w:hAnsi="Times New Roman"/>
+          <w:sz w:val="26"/>
+          <w:szCs w:val="26"/>
+        </w:rPr>
+        <w:t xml:space="preserve">a) Nếu Bên B cho rằng mình có quyền được gia hạn thời gian và/hoặc thanh toán bổ sung theo bất kỳ điều khoản nào của Hợp đồng, Bên B phải gửi thông báo bằng văn bản cho Bên A, nêu rõ sự kiện, căn cứ, trong vòng </w:t>
+      </w:r>
+      <w:r>
+        <w:rPr>
+          <w:rFonts w:ascii="Times New Roman" w:cs="Times New Roman" w:eastAsia="Times New Roman" w:hAnsi="Times New Roman"/>
+          <w:sz w:val="26"/>
+          <w:szCs w:val="26"/>
+          <w:highlight w:val="yellow"/>
+          <w:highlightCs w:val="yellow"/>
+        </w:rPr>
+        <w:t xml:space="preserve">……</w:t>
+      </w:r>
+      <w:r>
+        <w:rPr>
+          <w:rFonts w:ascii="Times New Roman" w:cs="Times New Roman" w:eastAsia="Times New Roman" w:hAnsi="Times New Roman"/>
+          <w:sz w:val="26"/>
+          <w:szCs w:val="26"/>
+        </w:rPr>
+        <w:t xml:space="preserve"> ngày kể từ ngày Bên B biết hoặc lẽ ra phải biết về sự kiện đó. Quá thời hạn này mà Bên B không thông báo thì Bên B mất quyền yêu cầu gia hạn thời gian, thanh toán bổ sung liên quan đến sự kiện đó.</w:t>
+      </w:r>
+    </w:p>
+    <w:p>
+      <w:pPr>
+        <w:spacing w:after="60" w:before="60" w:line="300"/>
+        <w:ind w:left="567"/>
+        <w:jc w:val="both"/>
+      </w:pPr>
+      <w:r>
+        <w:rPr>
+          <w:rFonts w:ascii="Times New Roman" w:cs="Times New Roman" w:eastAsia="Times New Roman" w:hAnsi="Times New Roman"/>
+          <w:sz w:val="26"/>
+          <w:szCs w:val="26"/>
+        </w:rPr>
+        <w:t xml:space="preserve">b) Trong vòng </w:t>
+      </w:r>
+      <w:r>
+        <w:rPr>
+          <w:rFonts w:ascii="Times New Roman" w:cs="Times New Roman" w:eastAsia="Times New Roman" w:hAnsi="Times New Roman"/>
+          <w:sz w:val="26"/>
+          <w:szCs w:val="26"/>
+          <w:highlight w:val="yellow"/>
+          <w:highlightCs w:val="yellow"/>
+        </w:rPr>
+        <w:t xml:space="preserve">……</w:t>
+      </w:r>
+      <w:r>
+        <w:rPr>
+          <w:rFonts w:ascii="Times New Roman" w:cs="Times New Roman" w:eastAsia="Times New Roman" w:hAnsi="Times New Roman"/>
+          <w:sz w:val="26"/>
+          <w:szCs w:val="26"/>
+        </w:rPr>
+        <w:t xml:space="preserve"> ngày kể từ ngày gửi thông báo, Bên B phải gửi hồ sơ khiếu nại chi tiết (căn cứ hợp đồng, tài liệu chứng minh, phân tích ảnh hưởng tiến độ, giá trị đề nghị). Bên A trả lời trong vòng </w:t>
+      </w:r>
+      <w:r>
+        <w:rPr>
+          <w:rFonts w:ascii="Times New Roman" w:cs="Times New Roman" w:eastAsia="Times New Roman" w:hAnsi="Times New Roman"/>
+          <w:sz w:val="26"/>
+          <w:szCs w:val="26"/>
+          <w:highlight w:val="yellow"/>
+          <w:highlightCs w:val="yellow"/>
+        </w:rPr>
+        <w:t xml:space="preserve">……</w:t>
+      </w:r>
+      <w:r>
+        <w:rPr>
+          <w:rFonts w:ascii="Times New Roman" w:cs="Times New Roman" w:eastAsia="Times New Roman" w:hAnsi="Times New Roman"/>
+          <w:sz w:val="26"/>
+          <w:szCs w:val="26"/>
+        </w:rPr>
+        <w:t xml:space="preserve"> ngày kể từ ngày nhận đủ hồ sơ.</w:t>
+      </w:r>
+    </w:p>
+    <w:p>
+      <w:pPr>
+        <w:spacing w:after="60" w:before="60" w:line="300"/>
+        <w:ind w:left="567"/>
+        <w:jc w:val="both"/>
+      </w:pPr>
+      <w:r>
+        <w:rPr>
+          <w:rFonts w:ascii="Times New Roman" w:cs="Times New Roman" w:eastAsia="Times New Roman" w:hAnsi="Times New Roman"/>
+          <w:sz w:val="26"/>
+          <w:szCs w:val="26"/>
+        </w:rPr>
+        <w:t xml:space="preserve">c) Trong khi giải quyết khiếu nại, Bên B vẫn phải tiếp tục thi công theo tiến độ và chỉ dẫn của Bên A.</w:t>
+      </w:r>
+    </w:p>
+    <w:p>
+      <w:pPr>
+        <w:keepNext/>
         <w:spacing w:after="80" w:before="200" w:line="300"/>
       </w:pPr>
       <w:r>
@@ -7739,7 +8000,7 @@
           <w:sz w:val="26"/>
           <w:szCs w:val="26"/>
         </w:rPr>
-        <w:t xml:space="preserve">16.1. Sự kiện bất khả kháng là sự kiện xảy ra mang tính khách quan, nằm ngoài tầm kiểm soát của các Bên như động đất, bão, lũ, lụt, lốc, sóng thần, lở đất, hỏa hoạn, chiến tranh hoặc có nguy cơ xảy ra chiến tranh, dịch bệnh được cơ quan có thẩm quyền công bố… và các thảm họa khác chưa lường hết được.</w:t>
+        <w:t xml:space="preserve">16.1. Sự kiện bất khả kháng là sự kiện xảy ra một cách khách quan, không thể lường trước được và không thể khắc phục được mặc dù đã áp dụng mọi biện pháp cần thiết và khả năng cho phép (theo Điều 156 Bộ luật Dân sự 2015), như động đất, bão, lũ, lụt, lốc, sóng thần, lở đất, hỏa hoạn, chiến tranh hoặc có nguy cơ xảy ra chiến tranh, dịch bệnh được cơ quan có thẩm quyền công bố… và các thảm họa khác chưa lường hết được.</w:t>
       </w:r>
     </w:p>
     <w:p>
@@ -8689,7 +8950,7 @@
           <w:sz w:val="26"/>
           <w:szCs w:val="26"/>
         </w:rPr>
-        <w:t xml:space="preserve">Các Bên thỏa thuận mức phạt và bồi thường theo Điều 86 Luật Xây dựng số 135/2025/QH15. Tổng mức phạt vi phạm đối với Bên B không vượt quá </w:t>
+        <w:t xml:space="preserve">Các Bên thỏa thuận mức phạt và bồi thường theo Điều 86 Luật Xây dựng số 135/2025/QH15 và Điều 301 Luật Thương mại. Mức phạt đối với mỗi vi phạm không vượt quá </w:t>
       </w:r>
       <w:r>
         <w:rPr>
@@ -8707,40 +8968,7 @@
           <w:sz w:val="26"/>
           <w:szCs w:val="26"/>
         </w:rPr>
-        <w:t xml:space="preserve">% giá trị Hợp đồng. Việc phạt vi phạm không loại trừ nghĩa vụ bồi thường toàn bộ thiệt hại thực tế của Bên A, bao gồm các khoản Bên A bị Chủ đầu tư phạt, khấu trừ, yêu cầu bồi thường do lỗi của Bên B. Bên A có quyền thu tiền phạt, bồi thường bằng cách khấu trừ vào tiền thanh toán Hợp đồng hoặc yêu cầu thanh toán từ bảo lãnh thực hiện hợp đồng.</w:t>
-      </w:r>
-    </w:p>
-    <w:p>
-      <w:pPr>
-        <w:spacing w:after="60" w:before="60" w:line="300"/>
-        <w:ind w:firstLine="567"/>
-        <w:jc w:val="both"/>
-      </w:pPr>
-      <w:r>
-        <w:rPr>
-          <w:rFonts w:ascii="Times New Roman" w:cs="Times New Roman" w:eastAsia="Times New Roman" w:hAnsi="Times New Roman"/>
-          <w:sz w:val="26"/>
-          <w:szCs w:val="26"/>
-        </w:rPr>
-        <w:t xml:space="preserve">18.1. </w:t>
-      </w:r>
-      <w:r>
-        <w:rPr>
-          <w:rFonts w:ascii="Times New Roman" w:cs="Times New Roman" w:eastAsia="Times New Roman" w:hAnsi="Times New Roman"/>
-          <w:b/>
-          <w:bCs/>
-          <w:sz w:val="26"/>
-          <w:szCs w:val="26"/>
-        </w:rPr>
-        <w:t xml:space="preserve">Phạt do vi phạm chất lượng:</w:t>
-      </w:r>
-      <w:r>
-        <w:rPr>
-          <w:rFonts w:ascii="Times New Roman" w:cs="Times New Roman" w:eastAsia="Times New Roman" w:hAnsi="Times New Roman"/>
-          <w:sz w:val="26"/>
-          <w:szCs w:val="26"/>
-        </w:rPr>
-        <w:t xml:space="preserve"> Nếu chất lượng Hạng mục công trình có một phần hay toàn bộ không bảo đảm đúng Hồ sơ thiết kế, Chỉ dẫn kỹ thuật, quy chuẩn, tiêu chuẩn có liên quan, Bên B phải chịu phạt </w:t>
+        <w:t xml:space="preserve">% giá trị phần nghĩa vụ hợp đồng bị vi phạm; tổng các khoản phạt đối với Bên B không vượt quá </w:t>
       </w:r>
       <w:r>
         <w:rPr>
@@ -8758,73 +8986,40 @@
           <w:sz w:val="26"/>
           <w:szCs w:val="26"/>
         </w:rPr>
-        <w:t xml:space="preserve">% giá trị phần công việc bị vi phạm, đồng thời vẫn phải dỡ bỏ, làm lại hoặc hoàn thiện công việc bằng chi phí của mình và bồi thường thiệt hại thực tế phát sinh cho Bên A (nếu có).</w:t>
-      </w:r>
-    </w:p>
-    <w:p>
-      <w:pPr>
-        <w:spacing w:after="60" w:before="60" w:line="300"/>
-        <w:ind w:firstLine="567"/>
-        <w:jc w:val="both"/>
-      </w:pPr>
-      <w:r>
-        <w:rPr>
-          <w:rFonts w:ascii="Times New Roman" w:cs="Times New Roman" w:eastAsia="Times New Roman" w:hAnsi="Times New Roman"/>
-          <w:sz w:val="26"/>
-          <w:szCs w:val="26"/>
-        </w:rPr>
-        <w:t xml:space="preserve">18.2. </w:t>
-      </w:r>
-      <w:r>
-        <w:rPr>
-          <w:rFonts w:ascii="Times New Roman" w:cs="Times New Roman" w:eastAsia="Times New Roman" w:hAnsi="Times New Roman"/>
-          <w:b/>
-          <w:bCs/>
-          <w:sz w:val="26"/>
-          <w:szCs w:val="26"/>
-        </w:rPr>
-        <w:t xml:space="preserve">Phạt do vi phạm an toàn, bảo vệ môi trường, nội quy công trường:</w:t>
-      </w:r>
-      <w:r>
-        <w:rPr>
-          <w:rFonts w:ascii="Times New Roman" w:cs="Times New Roman" w:eastAsia="Times New Roman" w:hAnsi="Times New Roman"/>
-          <w:sz w:val="26"/>
-          <w:szCs w:val="26"/>
-        </w:rPr>
-        <w:t xml:space="preserve"> Nếu Bên B không thực hiện hoặc thực hiện không đầy đủ các biện pháp bảo đảm an toàn lao động, an toàn làm việc trên cao, phòng chống cháy nổ, bảo vệ môi trường, nội quy công trường, Bên B phải chịu phạt theo mức quy định tại Biểu 05 [Mức phạt do vi phạm an toàn, bảo vệ môi trường, nội quy công trường] và phải bồi thường mọi thiệt hại cho Bên A, bên thứ ba (nếu có), đồng thời vẫn phải khắc phục hậu quả bằng chi phí của mình.</w:t>
-      </w:r>
-    </w:p>
-    <w:p>
-      <w:pPr>
-        <w:spacing w:after="60" w:before="60" w:line="300"/>
-        <w:ind w:firstLine="567"/>
-        <w:jc w:val="both"/>
-      </w:pPr>
-      <w:r>
-        <w:rPr>
-          <w:rFonts w:ascii="Times New Roman" w:cs="Times New Roman" w:eastAsia="Times New Roman" w:hAnsi="Times New Roman"/>
-          <w:sz w:val="26"/>
-          <w:szCs w:val="26"/>
-        </w:rPr>
-        <w:t xml:space="preserve">18.3. </w:t>
-      </w:r>
-      <w:r>
-        <w:rPr>
-          <w:rFonts w:ascii="Times New Roman" w:cs="Times New Roman" w:eastAsia="Times New Roman" w:hAnsi="Times New Roman"/>
-          <w:b/>
-          <w:bCs/>
-          <w:sz w:val="26"/>
-          <w:szCs w:val="26"/>
-        </w:rPr>
-        <w:t xml:space="preserve">Phạt do chậm tiến độ:</w:t>
-      </w:r>
-      <w:r>
-        <w:rPr>
-          <w:rFonts w:ascii="Times New Roman" w:cs="Times New Roman" w:eastAsia="Times New Roman" w:hAnsi="Times New Roman"/>
-          <w:sz w:val="26"/>
-          <w:szCs w:val="26"/>
-        </w:rPr>
-        <w:t xml:space="preserve"> Nếu Bên B chậm tiến độ (không do lỗi của Chủ đầu tư, Bên A, bên thứ ba không thuộc trách nhiệm của Bên B hoặc sự kiện bất khả kháng), mức phạt là </w:t>
+        <w:t xml:space="preserve">% giá trị Hợp đồng. Ngoài phạt vi phạm, Hai Bên thỏa thuận khoản bồi thường thiệt hại định trước đối với chậm tiến độ theo khoản 2 Điều 86 Luật Xây dựng tại Khoản 18.3. Việc phạt vi phạm không loại trừ nghĩa vụ bồi thường toàn bộ thiệt hại thực tế của Bên A, bao gồm các khoản Bên A bị Chủ đầu tư phạt, khấu trừ, yêu cầu bồi thường do lỗi của Bên B. Bên A có quyền thu tiền phạt, bồi thường bằng cách khấu trừ vào tiền thanh toán Hợp đồng hoặc yêu cầu thanh toán từ bảo lãnh thực hiện hợp đồng.</w:t>
+      </w:r>
+    </w:p>
+    <w:p>
+      <w:pPr>
+        <w:spacing w:after="60" w:before="60" w:line="300"/>
+        <w:ind w:firstLine="567"/>
+        <w:jc w:val="both"/>
+      </w:pPr>
+      <w:r>
+        <w:rPr>
+          <w:rFonts w:ascii="Times New Roman" w:cs="Times New Roman" w:eastAsia="Times New Roman" w:hAnsi="Times New Roman"/>
+          <w:sz w:val="26"/>
+          <w:szCs w:val="26"/>
+        </w:rPr>
+        <w:t xml:space="preserve">18.1. </w:t>
+      </w:r>
+      <w:r>
+        <w:rPr>
+          <w:rFonts w:ascii="Times New Roman" w:cs="Times New Roman" w:eastAsia="Times New Roman" w:hAnsi="Times New Roman"/>
+          <w:b/>
+          <w:bCs/>
+          <w:sz w:val="26"/>
+          <w:szCs w:val="26"/>
+        </w:rPr>
+        <w:t xml:space="preserve">Phạt do vi phạm chất lượng:</w:t>
+      </w:r>
+      <w:r>
+        <w:rPr>
+          <w:rFonts w:ascii="Times New Roman" w:cs="Times New Roman" w:eastAsia="Times New Roman" w:hAnsi="Times New Roman"/>
+          <w:sz w:val="26"/>
+          <w:szCs w:val="26"/>
+        </w:rPr>
+        <w:t xml:space="preserve"> Nếu chất lượng Hạng mục công trình có một phần hay toàn bộ không bảo đảm đúng Hồ sơ thiết kế, Chỉ dẫn kỹ thuật, quy chuẩn, tiêu chuẩn có liên quan, Bên B phải chịu phạt </w:t>
       </w:r>
       <w:r>
         <w:rPr>
@@ -8842,40 +9037,73 @@
           <w:sz w:val="26"/>
           <w:szCs w:val="26"/>
         </w:rPr>
-        <w:t xml:space="preserve">% giá trị Hợp đồng cho mỗi ngày chậm so với từng mốc tiến độ tại Khoản 7.1 và tiến độ chi tiết được Bên A chấp thuận; tổng mức phạt theo quy định tại đoạn đầu Điều này. Việc áp dụng phạt không loại trừ quyền của Bên A yêu cầu bồi thường thiệt hại thực tế, hợp lý, hợp lệ do việc chậm tiến độ gây ra.</w:t>
-      </w:r>
-    </w:p>
-    <w:p>
-      <w:pPr>
-        <w:spacing w:after="60" w:before="60" w:line="300"/>
-        <w:ind w:firstLine="567"/>
-        <w:jc w:val="both"/>
-      </w:pPr>
-      <w:r>
-        <w:rPr>
-          <w:rFonts w:ascii="Times New Roman" w:cs="Times New Roman" w:eastAsia="Times New Roman" w:hAnsi="Times New Roman"/>
-          <w:sz w:val="26"/>
-          <w:szCs w:val="26"/>
-        </w:rPr>
-        <w:t xml:space="preserve">18.4. </w:t>
-      </w:r>
-      <w:r>
-        <w:rPr>
-          <w:rFonts w:ascii="Times New Roman" w:cs="Times New Roman" w:eastAsia="Times New Roman" w:hAnsi="Times New Roman"/>
-          <w:b/>
-          <w:bCs/>
-          <w:sz w:val="26"/>
-          <w:szCs w:val="26"/>
-        </w:rPr>
-        <w:t xml:space="preserve">Phạt, bồi thường do chậm khắc phục sai sót:</w:t>
-      </w:r>
-      <w:r>
-        <w:rPr>
-          <w:rFonts w:ascii="Times New Roman" w:cs="Times New Roman" w:eastAsia="Times New Roman" w:hAnsi="Times New Roman"/>
-          <w:sz w:val="26"/>
-          <w:szCs w:val="26"/>
-        </w:rPr>
-        <w:t xml:space="preserve"> Trường hợp Bên B không kịp thời khắc phục sai sót theo thông báo của Bên A, Bên B phải bồi thường </w:t>
+        <w:t xml:space="preserve">% giá trị phần công việc bị vi phạm, đồng thời vẫn phải dỡ bỏ, làm lại hoặc hoàn thiện công việc bằng chi phí của mình và bồi thường thiệt hại thực tế phát sinh cho Bên A (nếu có).</w:t>
+      </w:r>
+    </w:p>
+    <w:p>
+      <w:pPr>
+        <w:spacing w:after="60" w:before="60" w:line="300"/>
+        <w:ind w:firstLine="567"/>
+        <w:jc w:val="both"/>
+      </w:pPr>
+      <w:r>
+        <w:rPr>
+          <w:rFonts w:ascii="Times New Roman" w:cs="Times New Roman" w:eastAsia="Times New Roman" w:hAnsi="Times New Roman"/>
+          <w:sz w:val="26"/>
+          <w:szCs w:val="26"/>
+        </w:rPr>
+        <w:t xml:space="preserve">18.2. </w:t>
+      </w:r>
+      <w:r>
+        <w:rPr>
+          <w:rFonts w:ascii="Times New Roman" w:cs="Times New Roman" w:eastAsia="Times New Roman" w:hAnsi="Times New Roman"/>
+          <w:b/>
+          <w:bCs/>
+          <w:sz w:val="26"/>
+          <w:szCs w:val="26"/>
+        </w:rPr>
+        <w:t xml:space="preserve">Phạt do vi phạm an toàn, bảo vệ môi trường, nội quy công trường:</w:t>
+      </w:r>
+      <w:r>
+        <w:rPr>
+          <w:rFonts w:ascii="Times New Roman" w:cs="Times New Roman" w:eastAsia="Times New Roman" w:hAnsi="Times New Roman"/>
+          <w:sz w:val="26"/>
+          <w:szCs w:val="26"/>
+        </w:rPr>
+        <w:t xml:space="preserve"> Nếu Bên B không thực hiện hoặc thực hiện không đầy đủ các biện pháp bảo đảm an toàn lao động, an toàn làm việc trên cao, phòng chống cháy nổ, bảo vệ môi trường, nội quy công trường, Bên B phải chịu phạt theo mức quy định tại Biểu 05 [Mức phạt do vi phạm an toàn, bảo vệ môi trường, nội quy công trường] và phải bồi thường mọi thiệt hại cho Bên A, bên thứ ba (nếu có), đồng thời vẫn phải khắc phục hậu quả bằng chi phí của mình.</w:t>
+      </w:r>
+    </w:p>
+    <w:p>
+      <w:pPr>
+        <w:spacing w:after="60" w:before="60" w:line="300"/>
+        <w:ind w:firstLine="567"/>
+        <w:jc w:val="both"/>
+      </w:pPr>
+      <w:r>
+        <w:rPr>
+          <w:rFonts w:ascii="Times New Roman" w:cs="Times New Roman" w:eastAsia="Times New Roman" w:hAnsi="Times New Roman"/>
+          <w:sz w:val="26"/>
+          <w:szCs w:val="26"/>
+        </w:rPr>
+        <w:t xml:space="preserve">18.3. </w:t>
+      </w:r>
+      <w:r>
+        <w:rPr>
+          <w:rFonts w:ascii="Times New Roman" w:cs="Times New Roman" w:eastAsia="Times New Roman" w:hAnsi="Times New Roman"/>
+          <w:b/>
+          <w:bCs/>
+          <w:sz w:val="26"/>
+          <w:szCs w:val="26"/>
+        </w:rPr>
+        <w:t xml:space="preserve">Phạt do chậm tiến độ:</w:t>
+      </w:r>
+      <w:r>
+        <w:rPr>
+          <w:rFonts w:ascii="Times New Roman" w:cs="Times New Roman" w:eastAsia="Times New Roman" w:hAnsi="Times New Roman"/>
+          <w:sz w:val="26"/>
+          <w:szCs w:val="26"/>
+        </w:rPr>
+        <w:t xml:space="preserve"> Nếu Bên B chậm tiến độ (không do lỗi của Chủ đầu tư, Bên A, bên thứ ba không thuộc trách nhiệm của Bên B hoặc sự kiện bất khả kháng), mức phạt là </w:t>
       </w:r>
       <w:r>
         <w:rPr>
@@ -8893,7 +9121,7 @@
           <w:sz w:val="26"/>
           <w:szCs w:val="26"/>
         </w:rPr>
-        <w:t xml:space="preserve">% chi phí thực tế Bên A khắc phục và chịu phạt thêm </w:t>
+        <w:t xml:space="preserve">% giá trị phần Hợp đồng bị chậm tiến độ (giá trị khối lượng của mốc tiến độ bị chậm) cho mỗi ngày chậm so với từng mốc tiến độ tại Khoản 7.1 và tiến độ chi tiết được Bên A chấp thuận, trong giới hạn quy định tại đoạn đầu Điều này. Ngoài ra, Bên B phải trả cho Bên A khoản bồi thường thiệt hại định trước bằng </w:t>
       </w:r>
       <w:r>
         <w:rPr>
@@ -8911,40 +9139,40 @@
           <w:sz w:val="26"/>
           <w:szCs w:val="26"/>
         </w:rPr>
-        <w:t xml:space="preserve">% chi phí khắc phục đó.</w:t>
-      </w:r>
-    </w:p>
-    <w:p>
-      <w:pPr>
-        <w:spacing w:after="60" w:before="60" w:line="300"/>
-        <w:ind w:firstLine="567"/>
-        <w:jc w:val="both"/>
-      </w:pPr>
-      <w:r>
-        <w:rPr>
-          <w:rFonts w:ascii="Times New Roman" w:cs="Times New Roman" w:eastAsia="Times New Roman" w:hAnsi="Times New Roman"/>
-          <w:sz w:val="26"/>
-          <w:szCs w:val="26"/>
-        </w:rPr>
-        <w:t xml:space="preserve">18.5. </w:t>
-      </w:r>
-      <w:r>
-        <w:rPr>
-          <w:rFonts w:ascii="Times New Roman" w:cs="Times New Roman" w:eastAsia="Times New Roman" w:hAnsi="Times New Roman"/>
-          <w:b/>
-          <w:bCs/>
-          <w:sz w:val="26"/>
-          <w:szCs w:val="26"/>
-        </w:rPr>
-        <w:t xml:space="preserve">Phạt do chậm đệ trình, giao nộp hồ sơ, tài liệu:</w:t>
-      </w:r>
-      <w:r>
-        <w:rPr>
-          <w:rFonts w:ascii="Times New Roman" w:cs="Times New Roman" w:eastAsia="Times New Roman" w:hAnsi="Times New Roman"/>
-          <w:sz w:val="26"/>
-          <w:szCs w:val="26"/>
-        </w:rPr>
-        <w:t xml:space="preserve"> Trường hợp Bên B không kịp thời đệ trình, giao nộp hồ sơ, tài liệu theo quy định của Hợp đồng và/hoặc thông báo của Bên A: văn bản nhắc nhở lần thứ nhất, phạt </w:t>
+        <w:t xml:space="preserve"> đồng cho mỗi ngày chậm mốc hoàn thành kết cấu (cất nóc) và mốc bàn giao, mà Bên A không phải chứng minh thiệt hại; khoản này không loại trừ quyền yêu cầu bồi thường phần thiệt hại thực tế vượt quá (bao gồm khoản Bên A bị Chủ đầu tư phạt, khấu trừ).</w:t>
+      </w:r>
+    </w:p>
+    <w:p>
+      <w:pPr>
+        <w:spacing w:after="60" w:before="60" w:line="300"/>
+        <w:ind w:firstLine="567"/>
+        <w:jc w:val="both"/>
+      </w:pPr>
+      <w:r>
+        <w:rPr>
+          <w:rFonts w:ascii="Times New Roman" w:cs="Times New Roman" w:eastAsia="Times New Roman" w:hAnsi="Times New Roman"/>
+          <w:sz w:val="26"/>
+          <w:szCs w:val="26"/>
+        </w:rPr>
+        <w:t xml:space="preserve">18.4. </w:t>
+      </w:r>
+      <w:r>
+        <w:rPr>
+          <w:rFonts w:ascii="Times New Roman" w:cs="Times New Roman" w:eastAsia="Times New Roman" w:hAnsi="Times New Roman"/>
+          <w:b/>
+          <w:bCs/>
+          <w:sz w:val="26"/>
+          <w:szCs w:val="26"/>
+        </w:rPr>
+        <w:t xml:space="preserve">Phạt, bồi thường do chậm khắc phục sai sót:</w:t>
+      </w:r>
+      <w:r>
+        <w:rPr>
+          <w:rFonts w:ascii="Times New Roman" w:cs="Times New Roman" w:eastAsia="Times New Roman" w:hAnsi="Times New Roman"/>
+          <w:sz w:val="26"/>
+          <w:szCs w:val="26"/>
+        </w:rPr>
+        <w:t xml:space="preserve"> Trường hợp Bên B không kịp thời khắc phục sai sót theo thông báo của Bên A, Bên B phải bồi thường </w:t>
       </w:r>
       <w:r>
         <w:rPr>
@@ -8962,7 +9190,7 @@
           <w:sz w:val="26"/>
           <w:szCs w:val="26"/>
         </w:rPr>
-        <w:t xml:space="preserve"> đồng; các lần nhắc nhở tiếp theo, mức phạt bằng </w:t>
+        <w:t xml:space="preserve">% chi phí thực tế Bên A khắc phục và chịu phạt thêm </w:t>
       </w:r>
       <w:r>
         <w:rPr>
@@ -8980,7 +9208,40 @@
           <w:sz w:val="26"/>
           <w:szCs w:val="26"/>
         </w:rPr>
-        <w:t xml:space="preserve"> lần mức phạt lần liền kề trước đó, nhưng tổng các khoản phạt đối với hành vi này không quá </w:t>
+        <w:t xml:space="preserve">% chi phí khắc phục đó.</w:t>
+      </w:r>
+    </w:p>
+    <w:p>
+      <w:pPr>
+        <w:spacing w:after="60" w:before="60" w:line="300"/>
+        <w:ind w:firstLine="567"/>
+        <w:jc w:val="both"/>
+      </w:pPr>
+      <w:r>
+        <w:rPr>
+          <w:rFonts w:ascii="Times New Roman" w:cs="Times New Roman" w:eastAsia="Times New Roman" w:hAnsi="Times New Roman"/>
+          <w:sz w:val="26"/>
+          <w:szCs w:val="26"/>
+        </w:rPr>
+        <w:t xml:space="preserve">18.5. </w:t>
+      </w:r>
+      <w:r>
+        <w:rPr>
+          <w:rFonts w:ascii="Times New Roman" w:cs="Times New Roman" w:eastAsia="Times New Roman" w:hAnsi="Times New Roman"/>
+          <w:b/>
+          <w:bCs/>
+          <w:sz w:val="26"/>
+          <w:szCs w:val="26"/>
+        </w:rPr>
+        <w:t xml:space="preserve">Phạt do chậm đệ trình, giao nộp hồ sơ, tài liệu:</w:t>
+      </w:r>
+      <w:r>
+        <w:rPr>
+          <w:rFonts w:ascii="Times New Roman" w:cs="Times New Roman" w:eastAsia="Times New Roman" w:hAnsi="Times New Roman"/>
+          <w:sz w:val="26"/>
+          <w:szCs w:val="26"/>
+        </w:rPr>
+        <w:t xml:space="preserve"> Trường hợp Bên B không kịp thời đệ trình, giao nộp hồ sơ, tài liệu theo quy định của Hợp đồng và/hoặc thông báo của Bên A: văn bản nhắc nhở lần thứ nhất, phạt </w:t>
       </w:r>
       <w:r>
         <w:rPr>
@@ -8998,40 +9259,7 @@
           <w:sz w:val="26"/>
           <w:szCs w:val="26"/>
         </w:rPr>
-        <w:t xml:space="preserve">% giá trị Hợp đồng; đồng thời phải bồi thường mọi thiệt hại cho Bên A, bên thứ ba (nếu có) do việc chậm trễ gây ra.</w:t>
-      </w:r>
-    </w:p>
-    <w:p>
-      <w:pPr>
-        <w:keepNext/>
-        <w:spacing w:after="60" w:before="60" w:line="300"/>
-        <w:ind w:firstLine="567"/>
-        <w:jc w:val="both"/>
-      </w:pPr>
-      <w:r>
-        <w:rPr>
-          <w:rFonts w:ascii="Times New Roman" w:cs="Times New Roman" w:eastAsia="Times New Roman" w:hAnsi="Times New Roman"/>
-          <w:b/>
-          <w:bCs/>
-          <w:sz w:val="26"/>
-          <w:szCs w:val="26"/>
-        </w:rPr>
-        <w:t xml:space="preserve">18.6. Phạt do chấm dứt Hợp đồng</w:t>
-      </w:r>
-    </w:p>
-    <w:p>
-      <w:pPr>
-        <w:spacing w:after="60" w:before="60" w:line="300"/>
-        <w:ind w:left="567"/>
-        <w:jc w:val="both"/>
-      </w:pPr>
-      <w:r>
-        <w:rPr>
-          <w:rFonts w:ascii="Times New Roman" w:cs="Times New Roman" w:eastAsia="Times New Roman" w:hAnsi="Times New Roman"/>
-          <w:sz w:val="26"/>
-          <w:szCs w:val="26"/>
-        </w:rPr>
-        <w:t xml:space="preserve">a) Trường hợp chấm dứt Hợp đồng do lỗi của Bên B: trong vòng </w:t>
+        <w:t xml:space="preserve"> đồng; các lần nhắc nhở tiếp theo, mức phạt bằng </w:t>
       </w:r>
       <w:r>
         <w:rPr>
@@ -9049,7 +9277,7 @@
           <w:sz w:val="26"/>
           <w:szCs w:val="26"/>
         </w:rPr>
-        <w:t xml:space="preserve"> ngày kể từ ngày chấm dứt, Bên B phải hoàn trả cho Bên A giá trị Bên A đã tạm ứng, thanh toán trừ đi giá trị khối lượng công việc đã được nghiệm thu hợp lệ tính đến thời điểm chấm dứt, đồng thời chịu phạt </w:t>
+        <w:t xml:space="preserve"> lần mức phạt lần liền kề trước đó, nhưng tổng các khoản phạt đối với hành vi này không quá </w:t>
       </w:r>
       <w:r>
         <w:rPr>
@@ -9067,7 +9295,76 @@
           <w:sz w:val="26"/>
           <w:szCs w:val="26"/>
         </w:rPr>
-        <w:t xml:space="preserve">% giá trị Hợp đồng.</w:t>
+        <w:t xml:space="preserve">% giá trị Hợp đồng; đồng thời phải bồi thường mọi thiệt hại cho Bên A, bên thứ ba (nếu có) do việc chậm trễ gây ra.</w:t>
+      </w:r>
+    </w:p>
+    <w:p>
+      <w:pPr>
+        <w:keepNext/>
+        <w:spacing w:after="60" w:before="60" w:line="300"/>
+        <w:ind w:firstLine="567"/>
+        <w:jc w:val="both"/>
+      </w:pPr>
+      <w:r>
+        <w:rPr>
+          <w:rFonts w:ascii="Times New Roman" w:cs="Times New Roman" w:eastAsia="Times New Roman" w:hAnsi="Times New Roman"/>
+          <w:b/>
+          <w:bCs/>
+          <w:sz w:val="26"/>
+          <w:szCs w:val="26"/>
+        </w:rPr>
+        <w:t xml:space="preserve">18.6. Phạt do chấm dứt Hợp đồng</w:t>
+      </w:r>
+    </w:p>
+    <w:p>
+      <w:pPr>
+        <w:spacing w:after="60" w:before="60" w:line="300"/>
+        <w:ind w:left="567"/>
+        <w:jc w:val="both"/>
+      </w:pPr>
+      <w:r>
+        <w:rPr>
+          <w:rFonts w:ascii="Times New Roman" w:cs="Times New Roman" w:eastAsia="Times New Roman" w:hAnsi="Times New Roman"/>
+          <w:sz w:val="26"/>
+          <w:szCs w:val="26"/>
+        </w:rPr>
+        <w:t xml:space="preserve">a) Trường hợp chấm dứt Hợp đồng do lỗi của Bên B: trong vòng </w:t>
+      </w:r>
+      <w:r>
+        <w:rPr>
+          <w:rFonts w:ascii="Times New Roman" w:cs="Times New Roman" w:eastAsia="Times New Roman" w:hAnsi="Times New Roman"/>
+          <w:sz w:val="26"/>
+          <w:szCs w:val="26"/>
+          <w:highlight w:val="yellow"/>
+          <w:highlightCs w:val="yellow"/>
+        </w:rPr>
+        <w:t xml:space="preserve">……</w:t>
+      </w:r>
+      <w:r>
+        <w:rPr>
+          <w:rFonts w:ascii="Times New Roman" w:cs="Times New Roman" w:eastAsia="Times New Roman" w:hAnsi="Times New Roman"/>
+          <w:sz w:val="26"/>
+          <w:szCs w:val="26"/>
+        </w:rPr>
+        <w:t xml:space="preserve"> ngày kể từ ngày chấm dứt, Bên B phải hoàn trả cho Bên A giá trị Bên A đã tạm ứng, thanh toán trừ đi giá trị khối lượng công việc đã được nghiệm thu hợp lệ tính đến thời điểm chấm dứt, đồng thời chịu phạt </w:t>
+      </w:r>
+      <w:r>
+        <w:rPr>
+          <w:rFonts w:ascii="Times New Roman" w:cs="Times New Roman" w:eastAsia="Times New Roman" w:hAnsi="Times New Roman"/>
+          <w:sz w:val="26"/>
+          <w:szCs w:val="26"/>
+          <w:highlight w:val="yellow"/>
+          <w:highlightCs w:val="yellow"/>
+        </w:rPr>
+        <w:t xml:space="preserve">……</w:t>
+      </w:r>
+      <w:r>
+        <w:rPr>
+          <w:rFonts w:ascii="Times New Roman" w:cs="Times New Roman" w:eastAsia="Times New Roman" w:hAnsi="Times New Roman"/>
+          <w:sz w:val="26"/>
+          <w:szCs w:val="26"/>
+        </w:rPr>
+        <w:t xml:space="preserve">% giá trị phần Hợp đồng chưa thực hiện.</w:t>
       </w:r>
     </w:p>
     <w:p>

</xml_diff>

<commit_message>
Dự thảo HĐ phần thân: bổ sung các điều khoản bảo vệ quyền lợi Bên A
Co-Authored-By: Claude Opus 5.5 <noreply@anthropic.com>
Claude-Session: https://claude.ai/code/session_019QLSuLC1cpcB21GuuDYzS7
</commit_message>
<xml_diff>
--- a/3. DỰ THẢO HĐ/HĐ NOXH YÊN SỞ - PHẦN THÂN.docx
+++ b/3. DỰ THẢO HĐ/HĐ NOXH YÊN SỞ - PHẦN THÂN.docx
@@ -2638,7 +2638,7 @@
           <w:sz w:val="26"/>
           <w:szCs w:val="26"/>
         </w:rPr>
-        <w:t xml:space="preserve">Không Bên nào được chuyển nhượng toàn bộ hoặc một phần Hợp đồng hoặc bất cứ phần lợi ích, quyền lợi nào theo Hợp đồng khi chưa có sự chấp thuận trước bằng văn bản của Bên kia. Bên B không được giao lại cho nhà thầu khác (thầu phụ, tổ đội) thực hiện bất kỳ phần công việc nào của Hợp đồng khi chưa có chấp thuận trước bằng văn bản của Bên A; việc được chấp thuận không làm giảm trách nhiệm của Bên B đối với toàn bộ công việc theo Hợp đồng.</w:t>
+        <w:t xml:space="preserve">Không Bên nào được chuyển nhượng toàn bộ hoặc một phần Hợp đồng hoặc bất cứ phần lợi ích, quyền lợi nào theo Hợp đồng khi chưa có sự chấp thuận trước bằng văn bản của Bên kia. Bên B không được giao lại cho nhà thầu khác (thầu phụ, tổ đội) thực hiện bất kỳ phần công việc nào của Hợp đồng khi chưa có chấp thuận trước bằng văn bản của Bên A; việc được chấp thuận không làm giảm trách nhiệm của Bên B đối với toàn bộ công việc theo Hợp đồng. Riêng Bên A được quyền chuyển giao toàn bộ hoặc một phần quyền, nghĩa vụ theo Hợp đồng này cho Chủ đầu tư hoặc đơn vị do Chủ đầu tư chỉ định (trong trường hợp Hợp đồng thầu chính bị chấm dứt hoặc theo yêu cầu của Chủ đầu tư) bằng thông báo bằng văn bản cho Bên B; Bên B cam kết tiếp tục thực hiện Hợp đồng với bên nhận chuyển giao theo các điều kiện không đổi.</w:t>
       </w:r>
     </w:p>
     <w:p>
@@ -2783,6 +2783,39 @@
           <w:szCs w:val="26"/>
         </w:rPr>
         <w:t xml:space="preserve">Hai Bên đồng ý rằng chi phí để Bên B thực hiện toàn bộ các nghĩa vụ, trách nhiệm của mình theo Hợp đồng này đã được tính đầy đủ trong giá Hợp đồng. Trường hợp Bên A phải thay Bên B thực hiện bất kỳ nghĩa vụ, trách nhiệm nào của Bên B theo Hợp đồng thì Bên A có quyền đưa khoản chi phí thực tế, hợp lý, hợp lệ phát sinh vào giá trị khấu trừ trong hồ sơ thanh toán của Bên B trên cơ sở hồ sơ, chứng từ thực tế. Bên A thông báo cho Bên B căn cứ xác định giá trị khấu trừ để Hai Bên đối chiếu, xác nhận; trường hợp cần xử lý ngay nhằm bảo đảm tiến độ, chất lượng, an toàn hoặc nghĩa vụ với Chủ đầu tư thì Bên A có quyền tạm khấu trừ trước và Hai Bên hoàn tất việc đối chiếu trong kỳ thanh toán gần nhất.</w:t>
+      </w:r>
+    </w:p>
+    <w:p>
+      <w:pPr>
+        <w:spacing w:after="60" w:before="60" w:line="300"/>
+        <w:ind w:firstLine="567"/>
+        <w:jc w:val="both"/>
+      </w:pPr>
+      <w:r>
+        <w:rPr>
+          <w:rFonts w:ascii="Times New Roman" w:cs="Times New Roman" w:eastAsia="Times New Roman" w:hAnsi="Times New Roman"/>
+          <w:sz w:val="26"/>
+          <w:szCs w:val="26"/>
+        </w:rPr>
+        <w:t xml:space="preserve">Trường hợp Bên A tự thực hiện hoặc thuê đơn vị khác thực hiện thay phần việc, nghĩa vụ của Bên B theo bất kỳ điều khoản nào của Hợp đồng, giá trị khấu trừ bao gồm chi phí thực tế cộng thêm chi phí quản lý của Bên A bằng </w:t>
+      </w:r>
+      <w:r>
+        <w:rPr>
+          <w:rFonts w:ascii="Times New Roman" w:cs="Times New Roman" w:eastAsia="Times New Roman" w:hAnsi="Times New Roman"/>
+          <w:sz w:val="26"/>
+          <w:szCs w:val="26"/>
+          <w:highlight w:val="yellow"/>
+          <w:highlightCs w:val="yellow"/>
+        </w:rPr>
+        <w:t xml:space="preserve">……</w:t>
+      </w:r>
+      <w:r>
+        <w:rPr>
+          <w:rFonts w:ascii="Times New Roman" w:cs="Times New Roman" w:eastAsia="Times New Roman" w:hAnsi="Times New Roman"/>
+          <w:sz w:val="26"/>
+          <w:szCs w:val="26"/>
+        </w:rPr>
+        <w:t xml:space="preserve">% chi phí thực tế đó.</w:t>
       </w:r>
     </w:p>
     <w:p>
@@ -5571,35 +5604,17 @@
     </w:p>
     <w:p>
       <w:pPr>
-        <w:keepNext/>
-        <w:spacing w:after="60" w:before="60" w:line="300"/>
-        <w:ind w:firstLine="567"/>
-        <w:jc w:val="both"/>
-      </w:pPr>
-      <w:r>
-        <w:rPr>
-          <w:rFonts w:ascii="Times New Roman" w:cs="Times New Roman" w:eastAsia="Times New Roman" w:hAnsi="Times New Roman"/>
-          <w:b/>
-          <w:bCs/>
-          <w:sz w:val="26"/>
-          <w:szCs w:val="26"/>
-        </w:rPr>
-        <w:t xml:space="preserve">10.8. Thời hạn thanh toán</w:t>
-      </w:r>
-    </w:p>
-    <w:p>
-      <w:pPr>
-        <w:spacing w:after="60" w:before="60" w:line="300"/>
-        <w:ind w:left="567"/>
-        <w:jc w:val="both"/>
-      </w:pPr>
-      <w:r>
-        <w:rPr>
-          <w:rFonts w:ascii="Times New Roman" w:cs="Times New Roman" w:eastAsia="Times New Roman" w:hAnsi="Times New Roman"/>
-          <w:sz w:val="26"/>
-          <w:szCs w:val="26"/>
-        </w:rPr>
-        <w:t xml:space="preserve">a) Thời hạn thanh toán các khoản tạm ứng, thanh toán đợt, thanh toán sau khi hoàn thành: trong vòng </w:t>
+        <w:spacing w:after="60" w:before="60" w:line="300"/>
+        <w:ind w:firstLine="567"/>
+        <w:jc w:val="both"/>
+      </w:pPr>
+      <w:r>
+        <w:rPr>
+          <w:rFonts w:ascii="Times New Roman" w:cs="Times New Roman" w:eastAsia="Times New Roman" w:hAnsi="Times New Roman"/>
+          <w:sz w:val="26"/>
+          <w:szCs w:val="26"/>
+        </w:rPr>
+        <w:t xml:space="preserve">Trường hợp Chủ đầu tư, cơ quan kiểm toán, thanh tra hoặc cơ quan nhà nước có thẩm quyền giảm trừ khối lượng, giá trị đối với phần công việc do Bên B thực hiện (kể cả sau khi đã quyết toán, thanh lý Hợp đồng) thì giá trị thanh toán cho Bên B được giảm trừ tương ứng; Bên B có trách nhiệm hoàn trả cho Bên A số tiền đã nhận vượt trong vòng </w:t>
       </w:r>
       <w:r>
         <w:rPr>
@@ -5617,37 +5632,40 @@
           <w:sz w:val="26"/>
           <w:szCs w:val="26"/>
         </w:rPr>
-        <w:t xml:space="preserve"> ngày làm việc kể từ ngày Bên A nhận được đầy đủ hồ sơ thanh toán hợp lệ của Bên B.</w:t>
-      </w:r>
-    </w:p>
-    <w:p>
-      <w:pPr>
-        <w:spacing w:after="60" w:before="60" w:line="300"/>
-        <w:ind w:left="567"/>
-        <w:jc w:val="both"/>
-      </w:pPr>
-      <w:r>
-        <w:rPr>
-          <w:rFonts w:ascii="Times New Roman" w:cs="Times New Roman" w:eastAsia="Times New Roman" w:hAnsi="Times New Roman"/>
-          <w:sz w:val="26"/>
-          <w:szCs w:val="26"/>
-        </w:rPr>
-        <w:t xml:space="preserve">b) Trường hợp Chủ đầu tư chậm thanh toán cho Bên A đối với phần công việc tương ứng, thời hạn thanh toán cho Bên B được lùi tương ứng với thời gian Chủ đầu tư chậm thanh toán; Bên A không bị coi là vi phạm nghĩa vụ thanh toán và không phải chịu lãi chậm trả trong trường hợp này.</w:t>
-      </w:r>
-    </w:p>
-    <w:p>
-      <w:pPr>
-        <w:spacing w:after="60" w:before="60" w:line="300"/>
-        <w:ind w:left="567"/>
-        <w:jc w:val="both"/>
-      </w:pPr>
-      <w:r>
-        <w:rPr>
-          <w:rFonts w:ascii="Times New Roman" w:cs="Times New Roman" w:eastAsia="Times New Roman" w:hAnsi="Times New Roman"/>
-          <w:sz w:val="26"/>
-          <w:szCs w:val="26"/>
-        </w:rPr>
-        <w:t xml:space="preserve">c) Ngoài trường hợp quy định tại điểm b Khoản này, nếu Bên A chậm thanh toán quá thời hạn quy định mà không có lý do chính đáng thì phải trả lãi trên số tiền chậm trả theo lãi suất </w:t>
+        <w:t xml:space="preserve"> ngày kể từ ngày nhận được thông báo của Bên A.</w:t>
+      </w:r>
+    </w:p>
+    <w:p>
+      <w:pPr>
+        <w:keepNext/>
+        <w:spacing w:after="60" w:before="60" w:line="300"/>
+        <w:ind w:firstLine="567"/>
+        <w:jc w:val="both"/>
+      </w:pPr>
+      <w:r>
+        <w:rPr>
+          <w:rFonts w:ascii="Times New Roman" w:cs="Times New Roman" w:eastAsia="Times New Roman" w:hAnsi="Times New Roman"/>
+          <w:b/>
+          <w:bCs/>
+          <w:sz w:val="26"/>
+          <w:szCs w:val="26"/>
+        </w:rPr>
+        <w:t xml:space="preserve">10.8. Thời hạn thanh toán</w:t>
+      </w:r>
+    </w:p>
+    <w:p>
+      <w:pPr>
+        <w:spacing w:after="60" w:before="60" w:line="300"/>
+        <w:ind w:left="567"/>
+        <w:jc w:val="both"/>
+      </w:pPr>
+      <w:r>
+        <w:rPr>
+          <w:rFonts w:ascii="Times New Roman" w:cs="Times New Roman" w:eastAsia="Times New Roman" w:hAnsi="Times New Roman"/>
+          <w:sz w:val="26"/>
+          <w:szCs w:val="26"/>
+        </w:rPr>
+        <w:t xml:space="preserve">a) Thời hạn thanh toán các khoản tạm ứng, thanh toán đợt, thanh toán sau khi hoàn thành: trong vòng </w:t>
       </w:r>
       <w:r>
         <w:rPr>
@@ -5665,7 +5683,37 @@
           <w:sz w:val="26"/>
           <w:szCs w:val="26"/>
         </w:rPr>
-        <w:t xml:space="preserve">%/năm, tính từ ngày thứ </w:t>
+        <w:t xml:space="preserve"> ngày làm việc kể từ ngày Bên A nhận được đầy đủ hồ sơ thanh toán hợp lệ của Bên B.</w:t>
+      </w:r>
+    </w:p>
+    <w:p>
+      <w:pPr>
+        <w:spacing w:after="60" w:before="60" w:line="300"/>
+        <w:ind w:left="567"/>
+        <w:jc w:val="both"/>
+      </w:pPr>
+      <w:r>
+        <w:rPr>
+          <w:rFonts w:ascii="Times New Roman" w:cs="Times New Roman" w:eastAsia="Times New Roman" w:hAnsi="Times New Roman"/>
+          <w:sz w:val="26"/>
+          <w:szCs w:val="26"/>
+        </w:rPr>
+        <w:t xml:space="preserve">b) Trường hợp Chủ đầu tư chậm thanh toán cho Bên A đối với phần công việc tương ứng, thời hạn thanh toán cho Bên B được lùi tương ứng với thời gian Chủ đầu tư chậm thanh toán; Bên A không bị coi là vi phạm nghĩa vụ thanh toán và không phải chịu lãi chậm trả trong trường hợp này.</w:t>
+      </w:r>
+    </w:p>
+    <w:p>
+      <w:pPr>
+        <w:spacing w:after="60" w:before="60" w:line="300"/>
+        <w:ind w:left="567"/>
+        <w:jc w:val="both"/>
+      </w:pPr>
+      <w:r>
+        <w:rPr>
+          <w:rFonts w:ascii="Times New Roman" w:cs="Times New Roman" w:eastAsia="Times New Roman" w:hAnsi="Times New Roman"/>
+          <w:sz w:val="26"/>
+          <w:szCs w:val="26"/>
+        </w:rPr>
+        <w:t xml:space="preserve">c) Ngoài trường hợp quy định tại điểm b Khoản này, nếu Bên A chậm thanh toán quá thời hạn quy định mà không có lý do chính đáng thì phải trả lãi trên số tiền chậm trả theo lãi suất </w:t>
       </w:r>
       <w:r>
         <w:rPr>
@@ -5683,22 +5731,7 @@
           <w:sz w:val="26"/>
           <w:szCs w:val="26"/>
         </w:rPr>
-        <w:t xml:space="preserve"> sau ngày đến hạn.</w:t>
-      </w:r>
-    </w:p>
-    <w:p>
-      <w:pPr>
-        <w:spacing w:after="60" w:before="60" w:line="300"/>
-        <w:ind w:left="567"/>
-        <w:jc w:val="both"/>
-      </w:pPr>
-      <w:r>
-        <w:rPr>
-          <w:rFonts w:ascii="Times New Roman" w:cs="Times New Roman" w:eastAsia="Times New Roman" w:hAnsi="Times New Roman"/>
-          <w:sz w:val="26"/>
-          <w:szCs w:val="26"/>
-        </w:rPr>
-        <w:t xml:space="preserve">d) Thời hạn thanh toán tiền giữ lại bảo hành: trong vòng </w:t>
+        <w:t xml:space="preserve">%/năm, tính từ ngày thứ </w:t>
       </w:r>
       <w:r>
         <w:rPr>
@@ -5716,6 +5749,39 @@
           <w:sz w:val="26"/>
           <w:szCs w:val="26"/>
         </w:rPr>
+        <w:t xml:space="preserve"> sau ngày đến hạn.</w:t>
+      </w:r>
+    </w:p>
+    <w:p>
+      <w:pPr>
+        <w:spacing w:after="60" w:before="60" w:line="300"/>
+        <w:ind w:left="567"/>
+        <w:jc w:val="both"/>
+      </w:pPr>
+      <w:r>
+        <w:rPr>
+          <w:rFonts w:ascii="Times New Roman" w:cs="Times New Roman" w:eastAsia="Times New Roman" w:hAnsi="Times New Roman"/>
+          <w:sz w:val="26"/>
+          <w:szCs w:val="26"/>
+        </w:rPr>
+        <w:t xml:space="preserve">d) Thời hạn thanh toán tiền giữ lại bảo hành: trong vòng </w:t>
+      </w:r>
+      <w:r>
+        <w:rPr>
+          <w:rFonts w:ascii="Times New Roman" w:cs="Times New Roman" w:eastAsia="Times New Roman" w:hAnsi="Times New Roman"/>
+          <w:sz w:val="26"/>
+          <w:szCs w:val="26"/>
+          <w:highlight w:val="yellow"/>
+          <w:highlightCs w:val="yellow"/>
+        </w:rPr>
+        <w:t xml:space="preserve">……</w:t>
+      </w:r>
+      <w:r>
+        <w:rPr>
+          <w:rFonts w:ascii="Times New Roman" w:cs="Times New Roman" w:eastAsia="Times New Roman" w:hAnsi="Times New Roman"/>
+          <w:sz w:val="26"/>
+          <w:szCs w:val="26"/>
+        </w:rPr>
         <w:t xml:space="preserve"> ngày làm việc kể từ ngày Bên A nhận được đầy đủ hồ sơ hợp lệ theo Khoản 10.6.</w:t>
       </w:r>
     </w:p>
@@ -5843,6 +5909,21 @@
           <w:szCs w:val="26"/>
         </w:rPr>
         <w:t xml:space="preserve">e) Trường hợp tại thời điểm thanh toán Bên B còn nợ Bên A bất kỳ khoản tiền nào, Bên A có quyền bù trừ các khoản nợ này vào các khoản thanh toán đến hạn của Bên B.</w:t>
+      </w:r>
+    </w:p>
+    <w:p>
+      <w:pPr>
+        <w:spacing w:after="60" w:before="60" w:line="300"/>
+        <w:ind w:left="567"/>
+        <w:jc w:val="both"/>
+      </w:pPr>
+      <w:r>
+        <w:rPr>
+          <w:rFonts w:ascii="Times New Roman" w:cs="Times New Roman" w:eastAsia="Times New Roman" w:hAnsi="Times New Roman"/>
+          <w:sz w:val="26"/>
+          <w:szCs w:val="26"/>
+        </w:rPr>
+        <w:t xml:space="preserve">f) Bên A có quyền tạm dừng thanh toán cho đến khi Bên B khắc phục, nếu Bên B: chưa nộp hoặc không gia hạn bảo lãnh, bảo hiểm theo Hợp đồng; chưa xuất hóa đơn hợp lệ cho các khoản đã thanh toán; chưa nộp hồ sơ chất lượng, hồ sơ hoàn công của phần việc đề nghị thanh toán; hoặc không chứng minh được đã thanh toán đầy đủ tiền lương cho người lao động của kỳ trước. Việc tạm dừng thanh toán trong các trường hợp này không bị coi là Bên A vi phạm nghĩa vụ thanh toán.</w:t>
       </w:r>
     </w:p>
     <w:p>
@@ -7247,17 +7328,143 @@
     </w:p>
     <w:p>
       <w:pPr>
-        <w:spacing w:after="60" w:before="60" w:line="300"/>
-        <w:ind w:firstLine="567"/>
-        <w:jc w:val="both"/>
-      </w:pPr>
-      <w:r>
-        <w:rPr>
-          <w:rFonts w:ascii="Times New Roman" w:cs="Times New Roman" w:eastAsia="Times New Roman" w:hAnsi="Times New Roman"/>
-          <w:sz w:val="26"/>
-          <w:szCs w:val="26"/>
-        </w:rPr>
-        <w:t xml:space="preserve">12.15. Các nghĩa vụ khác theo quy định của pháp luật.</w:t>
+        <w:keepNext/>
+        <w:spacing w:after="60" w:before="60" w:line="300"/>
+        <w:ind w:firstLine="567"/>
+        <w:jc w:val="both"/>
+      </w:pPr>
+      <w:r>
+        <w:rPr>
+          <w:rFonts w:ascii="Times New Roman" w:cs="Times New Roman" w:eastAsia="Times New Roman" w:hAnsi="Times New Roman"/>
+          <w:b/>
+          <w:bCs/>
+          <w:sz w:val="26"/>
+          <w:szCs w:val="26"/>
+        </w:rPr>
+        <w:t xml:space="preserve">12.15. Các cam kết khác của Bên B</w:t>
+      </w:r>
+    </w:p>
+    <w:p>
+      <w:pPr>
+        <w:spacing w:after="60" w:before="60" w:line="300"/>
+        <w:ind w:left="567"/>
+        <w:jc w:val="both"/>
+      </w:pPr>
+      <w:r>
+        <w:rPr>
+          <w:rFonts w:ascii="Times New Roman" w:cs="Times New Roman" w:eastAsia="Times New Roman" w:hAnsi="Times New Roman"/>
+          <w:sz w:val="26"/>
+          <w:szCs w:val="26"/>
+        </w:rPr>
+        <w:t xml:space="preserve">a) Không làm việc, đề xuất, khiếu nại hoặc đòi thanh toán trực tiếp với Chủ đầu tư, Tư vấn về các vấn đề thuộc Hợp đồng này khi chưa có chấp thuận của Bên A; mọi giao dịch với Chủ đầu tư, Tư vấn liên quan đến công việc của Bên B được thực hiện thông qua Bên A.</w:t>
+      </w:r>
+    </w:p>
+    <w:p>
+      <w:pPr>
+        <w:spacing w:after="60" w:before="60" w:line="300"/>
+        <w:ind w:left="567"/>
+        <w:jc w:val="both"/>
+      </w:pPr>
+      <w:r>
+        <w:rPr>
+          <w:rFonts w:ascii="Times New Roman" w:cs="Times New Roman" w:eastAsia="Times New Roman" w:hAnsi="Times New Roman"/>
+          <w:sz w:val="26"/>
+          <w:szCs w:val="26"/>
+        </w:rPr>
+        <w:t xml:space="preserve">b) Không lôi kéo, tuyển dụng cán bộ, nhân viên của Bên A trong thời gian thực hiện Hợp đồng và </w:t>
+      </w:r>
+      <w:r>
+        <w:rPr>
+          <w:rFonts w:ascii="Times New Roman" w:cs="Times New Roman" w:eastAsia="Times New Roman" w:hAnsi="Times New Roman"/>
+          <w:sz w:val="26"/>
+          <w:szCs w:val="26"/>
+          <w:highlight w:val="yellow"/>
+          <w:highlightCs w:val="yellow"/>
+        </w:rPr>
+        <w:t xml:space="preserve">……</w:t>
+      </w:r>
+      <w:r>
+        <w:rPr>
+          <w:rFonts w:ascii="Times New Roman" w:cs="Times New Roman" w:eastAsia="Times New Roman" w:hAnsi="Times New Roman"/>
+          <w:sz w:val="26"/>
+          <w:szCs w:val="26"/>
+        </w:rPr>
+        <w:t xml:space="preserve"> tháng sau khi Hợp đồng chấm dứt; không trực tiếp hoặc gián tiếp ký hợp đồng với Chủ đầu tư cho các công việc thuộc phạm vi Hợp đồng thầu chính khi chưa có chấp thuận của Bên A.</w:t>
+      </w:r>
+    </w:p>
+    <w:p>
+      <w:pPr>
+        <w:spacing w:after="60" w:before="60" w:line="300"/>
+        <w:ind w:left="567"/>
+        <w:jc w:val="both"/>
+      </w:pPr>
+      <w:r>
+        <w:rPr>
+          <w:rFonts w:ascii="Times New Roman" w:cs="Times New Roman" w:eastAsia="Times New Roman" w:hAnsi="Times New Roman"/>
+          <w:sz w:val="26"/>
+          <w:szCs w:val="26"/>
+        </w:rPr>
+        <w:t xml:space="preserve">c) Từ bỏ quyền cầm giữ tài sản (theo Điều 346 Bộ luật Dân sự) đối với Hạng mục công trình, vật tư, tài liệu; trong mọi trường hợp (kể cả khi có tranh chấp về thanh toán) Bên B không được chiếm giữ, cản trở việc Bên A, Chủ đầu tư hoặc nhà thầu khác tiếp cận, sử dụng mặt bằng, Hạng mục công trình.</w:t>
+      </w:r>
+    </w:p>
+    <w:p>
+      <w:pPr>
+        <w:spacing w:after="60" w:before="60" w:line="300"/>
+        <w:ind w:left="567"/>
+        <w:jc w:val="both"/>
+      </w:pPr>
+      <w:r>
+        <w:rPr>
+          <w:rFonts w:ascii="Times New Roman" w:cs="Times New Roman" w:eastAsia="Times New Roman" w:hAnsi="Times New Roman"/>
+          <w:sz w:val="26"/>
+          <w:szCs w:val="26"/>
+        </w:rPr>
+        <w:t xml:space="preserve">d) Chi trả đầy đủ, đúng hạn tiền lương cho người lao động; hằng tháng nộp cho Bên A bảng lương, chứng từ chi trả của kỳ trước. Trường hợp người lao động của Bên B ngừng việc, khiếu kiện, tụ tập do Bên B nợ lương, Bên A có quyền chi trả trực tiếp cho người lao động trên cơ sở danh sách, bảng chấm công do Bên B lập hoặc Bên A xác lập, và khấu trừ vào giá trị thanh toán của Bên B kèm phí quản lý theo Khoản 3.5.</w:t>
+      </w:r>
+    </w:p>
+    <w:p>
+      <w:pPr>
+        <w:spacing w:after="60" w:before="60" w:line="300"/>
+        <w:ind w:left="567"/>
+        <w:jc w:val="both"/>
+      </w:pPr>
+      <w:r>
+        <w:rPr>
+          <w:rFonts w:ascii="Times New Roman" w:cs="Times New Roman" w:eastAsia="Times New Roman" w:hAnsi="Times New Roman"/>
+          <w:sz w:val="26"/>
+          <w:szCs w:val="26"/>
+        </w:rPr>
+        <w:t xml:space="preserve">e) Toàn bộ bản vẽ triển khai, hồ sơ hoàn công, biện pháp thi công và tài liệu do Bên B lập cho Hạng mục công trình thuộc quyền sở hữu của Bên A; Bên B không được sử dụng cho mục đích khác khi chưa có chấp thuận của Bên A.</w:t>
+      </w:r>
+    </w:p>
+    <w:p>
+      <w:pPr>
+        <w:spacing w:after="60" w:before="60" w:line="300"/>
+        <w:ind w:left="567"/>
+        <w:jc w:val="both"/>
+      </w:pPr>
+      <w:r>
+        <w:rPr>
+          <w:rFonts w:ascii="Times New Roman" w:cs="Times New Roman" w:eastAsia="Times New Roman" w:hAnsi="Times New Roman"/>
+          <w:sz w:val="26"/>
+          <w:szCs w:val="26"/>
+        </w:rPr>
+        <w:t xml:space="preserve">f) Không đưa, hứa đưa, môi giới hối lộ hoặc bất kỳ lợi ích vật chất nào cho cán bộ, nhân viên của Bên A, Chủ đầu tư, Tư vấn nhằm tác động đến việc nghiệm thu, thanh toán, phê duyệt. Vi phạm cam kết này là căn cứ để Bên A đơn phương chấm dứt Hợp đồng theo Khoản 17.2 và áp dụng phạt, bồi thường theo Điều 18.</w:t>
+      </w:r>
+    </w:p>
+    <w:p>
+      <w:pPr>
+        <w:spacing w:after="60" w:before="60" w:line="300"/>
+        <w:ind w:firstLine="567"/>
+        <w:jc w:val="both"/>
+      </w:pPr>
+      <w:r>
+        <w:rPr>
+          <w:rFonts w:ascii="Times New Roman" w:cs="Times New Roman" w:eastAsia="Times New Roman" w:hAnsi="Times New Roman"/>
+          <w:sz w:val="26"/>
+          <w:szCs w:val="26"/>
+        </w:rPr>
+        <w:t xml:space="preserve">12.16. Các nghĩa vụ khác theo quy định của pháp luật.</w:t>
       </w:r>
     </w:p>
     <w:p>
@@ -7821,7 +8028,7 @@
           <w:sz w:val="26"/>
           <w:szCs w:val="26"/>
         </w:rPr>
-        <w:t xml:space="preserve">14.8. Mức hao hụt cho phép, phương pháp xác định khối lượng vượt định mức và cách khấu trừ được quy định tại Biểu 07 [Danh mục vật tư Bên A cấp và hao hụt cho phép]. Định kỳ hằng tháng và khi kết thúc từng khối, Hai Bên đối chiếu vật tư nhận – sử dụng – tồn. Sau khi hoàn thành công việc, Bên B hoàn trả cho Bên A vật tư không sử dụng hết (nếu có) bằng biên bản bàn giao làm cơ sở quyết toán vật tư.</w:t>
+        <w:t xml:space="preserve">14.8. Mức hao hụt cho phép, phương pháp xác định khối lượng vượt định mức và cách khấu trừ được quy định tại Biểu 07 [Danh mục vật tư Bên A cấp và hao hụt cho phép]. Định kỳ hằng tháng và khi kết thúc từng khối, Hai Bên đối chiếu vật tư nhận – sử dụng – tồn. Sau khi hoàn thành công việc, Bên B hoàn trả cho Bên A vật tư không sử dụng hết (nếu có) bằng biên bản bàn giao làm cơ sở quyết toán vật tư. Giá trị vật tư vượt định mức hao hụt, vật tư mất mát, hư hỏng hoặc sử dụng sai mục đích được khấu trừ vào giá trị thanh toán của Bên B theo giá vật tư tại thời điểm khấu trừ (hoặc giá mua của Bên A, lấy giá cao hơn), cộng thuế GTGT và chi phí quản lý theo Khoản 3.5.</w:t>
       </w:r>
     </w:p>
     <w:p>
@@ -9417,6 +9624,39 @@
     </w:p>
     <w:p>
       <w:pPr>
+        <w:spacing w:after="60" w:before="60" w:line="300"/>
+        <w:ind w:firstLine="567"/>
+        <w:jc w:val="both"/>
+      </w:pPr>
+      <w:r>
+        <w:rPr>
+          <w:rFonts w:ascii="Times New Roman" w:cs="Times New Roman" w:eastAsia="Times New Roman" w:hAnsi="Times New Roman"/>
+          <w:sz w:val="26"/>
+          <w:szCs w:val="26"/>
+        </w:rPr>
+        <w:t xml:space="preserve">18.8. </w:t>
+      </w:r>
+      <w:r>
+        <w:rPr>
+          <w:rFonts w:ascii="Times New Roman" w:cs="Times New Roman" w:eastAsia="Times New Roman" w:hAnsi="Times New Roman"/>
+          <w:b/>
+          <w:bCs/>
+          <w:sz w:val="26"/>
+          <w:szCs w:val="26"/>
+        </w:rPr>
+        <w:t xml:space="preserve">Giới hạn trách nhiệm của Bên A:</w:t>
+      </w:r>
+      <w:r>
+        <w:rPr>
+          <w:rFonts w:ascii="Times New Roman" w:cs="Times New Roman" w:eastAsia="Times New Roman" w:hAnsi="Times New Roman"/>
+          <w:sz w:val="26"/>
+          <w:szCs w:val="26"/>
+        </w:rPr>
+        <w:t xml:space="preserve"> Tổng trách nhiệm của Bên A đối với Bên B theo hoặc liên quan đến Hợp đồng (bao gồm thanh toán, bồi thường) không vượt quá giá trị khối lượng Bên B đã thực hiện được nghiệm thu hợp lệ mà Bên A chưa thanh toán. Bên A không chịu trách nhiệm đối với các thiệt hại gián tiếp, mất lợi nhuận, mất cơ hội kinh doanh của Bên B trong mọi trường hợp.</w:t>
+      </w:r>
+    </w:p>
+    <w:p>
+      <w:pPr>
         <w:keepNext/>
         <w:spacing w:after="80" w:before="200" w:line="300"/>
       </w:pPr>
@@ -10023,62 +10263,34 @@
     <w:p>
       <w:pPr>
         <w:keepNext/>
-        <w:spacing w:after="80" w:before="200" w:line="300"/>
-      </w:pPr>
-      <w:r>
-        <w:rPr>
-          <w:rFonts w:ascii="Times New Roman" w:cs="Times New Roman" w:eastAsia="Times New Roman" w:hAnsi="Times New Roman"/>
-          <w:b/>
-          <w:bCs/>
-          <w:sz w:val="26"/>
-          <w:szCs w:val="26"/>
-        </w:rPr>
-        <w:t xml:space="preserve">Điều 21. TRANH CHẤP VÀ GIẢI QUYẾT TRANH CHẤP</w:t>
-      </w:r>
-    </w:p>
-    <w:p>
-      <w:pPr>
-        <w:spacing w:after="60" w:before="60" w:line="300"/>
-        <w:ind w:firstLine="567"/>
-        <w:jc w:val="both"/>
-      </w:pPr>
-      <w:r>
-        <w:rPr>
-          <w:rFonts w:ascii="Times New Roman" w:cs="Times New Roman" w:eastAsia="Times New Roman" w:hAnsi="Times New Roman"/>
-          <w:sz w:val="26"/>
-          <w:szCs w:val="26"/>
-        </w:rPr>
-        <w:t xml:space="preserve">21.1. Trong quá trình thực hiện Hợp đồng, nếu có tranh chấp, vướng mắc nảy sinh, các Bên phải thông báo cho nhau bằng văn bản và nỗ lực chủ động thương lượng, hòa giải trên tinh thần hợp tác. Trường hợp không thương lượng được, tranh chấp được đưa ra Tòa án có thẩm quyền nơi Bên A đặt trụ sở để giải quyết theo quy định của pháp luật; Bên thua kiện chịu án phí theo quy định và hoàn trả cho Bên thắng kiện chi phí luật sư, chi phí giám định hợp lý. Trong thời gian giải quyết tranh chấp, Bên B vẫn phải tiếp tục thực hiện các nghĩa vụ không bị tranh chấp theo Hợp đồng, không được tự ý dừng thi công.</w:t>
-      </w:r>
-    </w:p>
-    <w:p>
-      <w:pPr>
-        <w:spacing w:after="60" w:before="60" w:line="300"/>
-        <w:ind w:firstLine="567"/>
-        <w:jc w:val="both"/>
-      </w:pPr>
-      <w:r>
-        <w:rPr>
-          <w:rFonts w:ascii="Times New Roman" w:cs="Times New Roman" w:eastAsia="Times New Roman" w:hAnsi="Times New Roman"/>
-          <w:sz w:val="26"/>
-          <w:szCs w:val="26"/>
-        </w:rPr>
-        <w:t xml:space="preserve">21.2. Hợp đồng bị vô hiệu hoặc chấm dứt không ảnh hưởng đến hiệu lực của các điều khoản về giải quyết tranh chấp, phạt và bồi thường. Trường hợp một phần nội dung Hợp đồng bị vô hiệu thì không ảnh hưởng đến các nội dung khác và hiệu lực của Hợp đồng.</w:t>
-      </w:r>
-    </w:p>
-    <w:p>
-      <w:pPr>
-        <w:spacing w:after="60" w:before="60" w:line="300"/>
-        <w:ind w:firstLine="567"/>
-        <w:jc w:val="both"/>
-      </w:pPr>
-      <w:r>
-        <w:rPr>
-          <w:rFonts w:ascii="Times New Roman" w:cs="Times New Roman" w:eastAsia="Times New Roman" w:hAnsi="Times New Roman"/>
-          <w:sz w:val="26"/>
-          <w:szCs w:val="26"/>
-        </w:rPr>
-        <w:t xml:space="preserve">21.3. Hợp đồng này là cơ sở pháp lý cao nhất để giải quyết tranh chấp giữa Hai Bên. Các vấn đề chưa được thỏa thuận trong Hợp đồng được giải quyết theo quy định của pháp luật có liên quan.</w:t>
+        <w:spacing w:after="60" w:before="60" w:line="300"/>
+        <w:ind w:firstLine="567"/>
+        <w:jc w:val="both"/>
+      </w:pPr>
+      <w:r>
+        <w:rPr>
+          <w:rFonts w:ascii="Times New Roman" w:cs="Times New Roman" w:eastAsia="Times New Roman" w:hAnsi="Times New Roman"/>
+          <w:b/>
+          <w:bCs/>
+          <w:sz w:val="26"/>
+          <w:szCs w:val="26"/>
+        </w:rPr>
+        <w:t xml:space="preserve">20.4. Quyền yêu cầu thanh toán bảo lãnh</w:t>
+      </w:r>
+    </w:p>
+    <w:p>
+      <w:pPr>
+        <w:spacing w:after="60" w:before="60" w:line="300"/>
+        <w:ind w:firstLine="567"/>
+        <w:jc w:val="both"/>
+      </w:pPr>
+      <w:r>
+        <w:rPr>
+          <w:rFonts w:ascii="Times New Roman" w:cs="Times New Roman" w:eastAsia="Times New Roman" w:hAnsi="Times New Roman"/>
+          <w:sz w:val="26"/>
+          <w:szCs w:val="26"/>
+        </w:rPr>
+        <w:t xml:space="preserve">Bên A có quyền yêu cầu ngân hàng bảo lãnh thanh toán toàn bộ hoặc một phần giá trị bảo lãnh khi Bên B vi phạm nghĩa vụ được bảo đảm, mà không cần có sự đồng ý của Bên B hay phán quyết của Tòa án. Bên B không được yêu cầu ngân hàng ngừng, trì hoãn việc thanh toán bảo lãnh. Trường hợp giá trị bảo lãnh không đủ bù đắp, Bên B phải thanh toán phần còn thiếu cho Bên A.</w:t>
       </w:r>
     </w:p>
     <w:p>
@@ -10094,6 +10306,67 @@
           <w:sz w:val="26"/>
           <w:szCs w:val="26"/>
         </w:rPr>
+        <w:t xml:space="preserve">Điều 21. TRANH CHẤP VÀ GIẢI QUYẾT TRANH CHẤP</w:t>
+      </w:r>
+    </w:p>
+    <w:p>
+      <w:pPr>
+        <w:spacing w:after="60" w:before="60" w:line="300"/>
+        <w:ind w:firstLine="567"/>
+        <w:jc w:val="both"/>
+      </w:pPr>
+      <w:r>
+        <w:rPr>
+          <w:rFonts w:ascii="Times New Roman" w:cs="Times New Roman" w:eastAsia="Times New Roman" w:hAnsi="Times New Roman"/>
+          <w:sz w:val="26"/>
+          <w:szCs w:val="26"/>
+        </w:rPr>
+        <w:t xml:space="preserve">21.1. Trong quá trình thực hiện Hợp đồng, nếu có tranh chấp, vướng mắc nảy sinh, các Bên phải thông báo cho nhau bằng văn bản và nỗ lực chủ động thương lượng, hòa giải trên tinh thần hợp tác. Trường hợp không thương lượng được, tranh chấp được đưa ra Tòa án có thẩm quyền nơi Bên A đặt trụ sở để giải quyết theo quy định của pháp luật; Bên thua kiện chịu án phí theo quy định và hoàn trả cho Bên thắng kiện chi phí luật sư, chi phí giám định hợp lý. Trong thời gian giải quyết tranh chấp, Bên B vẫn phải tiếp tục thực hiện các nghĩa vụ không bị tranh chấp theo Hợp đồng, không được tự ý dừng thi công.</w:t>
+      </w:r>
+    </w:p>
+    <w:p>
+      <w:pPr>
+        <w:spacing w:after="60" w:before="60" w:line="300"/>
+        <w:ind w:firstLine="567"/>
+        <w:jc w:val="both"/>
+      </w:pPr>
+      <w:r>
+        <w:rPr>
+          <w:rFonts w:ascii="Times New Roman" w:cs="Times New Roman" w:eastAsia="Times New Roman" w:hAnsi="Times New Roman"/>
+          <w:sz w:val="26"/>
+          <w:szCs w:val="26"/>
+        </w:rPr>
+        <w:t xml:space="preserve">21.2. Hợp đồng bị vô hiệu hoặc chấm dứt không ảnh hưởng đến hiệu lực của các điều khoản về giải quyết tranh chấp, phạt và bồi thường. Trường hợp một phần nội dung Hợp đồng bị vô hiệu thì không ảnh hưởng đến các nội dung khác và hiệu lực của Hợp đồng.</w:t>
+      </w:r>
+    </w:p>
+    <w:p>
+      <w:pPr>
+        <w:spacing w:after="60" w:before="60" w:line="300"/>
+        <w:ind w:firstLine="567"/>
+        <w:jc w:val="both"/>
+      </w:pPr>
+      <w:r>
+        <w:rPr>
+          <w:rFonts w:ascii="Times New Roman" w:cs="Times New Roman" w:eastAsia="Times New Roman" w:hAnsi="Times New Roman"/>
+          <w:sz w:val="26"/>
+          <w:szCs w:val="26"/>
+        </w:rPr>
+        <w:t xml:space="preserve">21.3. Hợp đồng này là cơ sở pháp lý cao nhất để giải quyết tranh chấp giữa Hai Bên. Các vấn đề chưa được thỏa thuận trong Hợp đồng được giải quyết theo quy định của pháp luật có liên quan.</w:t>
+      </w:r>
+    </w:p>
+    <w:p>
+      <w:pPr>
+        <w:keepNext/>
+        <w:spacing w:after="80" w:before="200" w:line="300"/>
+      </w:pPr>
+      <w:r>
+        <w:rPr>
+          <w:rFonts w:ascii="Times New Roman" w:cs="Times New Roman" w:eastAsia="Times New Roman" w:hAnsi="Times New Roman"/>
+          <w:b/>
+          <w:bCs/>
+          <w:sz w:val="26"/>
+          <w:szCs w:val="26"/>
+        </w:rPr>
         <w:t xml:space="preserve">Điều 22. ĐIỀU KHOẢN CHUNG</w:t>
       </w:r>
     </w:p>
@@ -10139,22 +10412,37 @@
           <w:sz w:val="26"/>
           <w:szCs w:val="26"/>
         </w:rPr>
-        <w:t xml:space="preserve">22.3. Hợp đồng này có hiệu lực kể từ ngày ký.</w:t>
-      </w:r>
-    </w:p>
-    <w:p>
-      <w:pPr>
-        <w:spacing w:after="60" w:before="60" w:line="300"/>
-        <w:ind w:firstLine="567"/>
-        <w:jc w:val="both"/>
-      </w:pPr>
-      <w:r>
-        <w:rPr>
-          <w:rFonts w:ascii="Times New Roman" w:cs="Times New Roman" w:eastAsia="Times New Roman" w:hAnsi="Times New Roman"/>
-          <w:sz w:val="26"/>
-          <w:szCs w:val="26"/>
-        </w:rPr>
-        <w:t xml:space="preserve">22.4. Hợp đồng được lập thành </w:t>
+        <w:t xml:space="preserve">22.3. Việc Bên A không thực hiện hoặc chậm thực hiện bất kỳ quyền nào theo Hợp đồng (kể cả việc đã thanh toán, nghiệm thu) không được coi là Bên A từ bỏ quyền đó hoặc chấp thuận vi phạm của Bên B.</w:t>
+      </w:r>
+    </w:p>
+    <w:p>
+      <w:pPr>
+        <w:spacing w:after="60" w:before="60" w:line="300"/>
+        <w:ind w:firstLine="567"/>
+        <w:jc w:val="both"/>
+      </w:pPr>
+      <w:r>
+        <w:rPr>
+          <w:rFonts w:ascii="Times New Roman" w:cs="Times New Roman" w:eastAsia="Times New Roman" w:hAnsi="Times New Roman"/>
+          <w:sz w:val="26"/>
+          <w:szCs w:val="26"/>
+        </w:rPr>
+        <w:t xml:space="preserve">22.4. Hợp đồng này có hiệu lực kể từ ngày ký.</w:t>
+      </w:r>
+    </w:p>
+    <w:p>
+      <w:pPr>
+        <w:spacing w:after="60" w:before="60" w:line="300"/>
+        <w:ind w:firstLine="567"/>
+        <w:jc w:val="both"/>
+      </w:pPr>
+      <w:r>
+        <w:rPr>
+          <w:rFonts w:ascii="Times New Roman" w:cs="Times New Roman" w:eastAsia="Times New Roman" w:hAnsi="Times New Roman"/>
+          <w:sz w:val="26"/>
+          <w:szCs w:val="26"/>
+        </w:rPr>
+        <w:t xml:space="preserve">22.5. Hợp đồng được lập thành </w:t>
       </w:r>
       <w:r>
         <w:rPr>

</xml_diff>

<commit_message>
Dự thảo HĐ phần thân: rà soát, bổ sung định nghĩa Điều 1
Co-Authored-By: Claude Opus 5.5 <noreply@anthropic.com>
Claude-Session: https://claude.ai/code/session_019QLSuLC1cpcB21GuuDYzS7
</commit_message>
<xml_diff>
--- a/3. DỰ THẢO HĐ/HĐ NOXH YÊN SỞ - PHẦN THÂN.docx
+++ b/3. DỰ THẢO HĐ/HĐ NOXH YÊN SỞ - PHẦN THÂN.docx
@@ -1597,6 +1597,24 @@
     </w:p>
     <w:p>
       <w:pPr>
+        <w:keepNext/>
+        <w:spacing w:after="60" w:before="60" w:line="300"/>
+        <w:ind w:firstLine="567"/>
+        <w:jc w:val="both"/>
+      </w:pPr>
+      <w:r>
+        <w:rPr>
+          <w:rFonts w:ascii="Times New Roman" w:cs="Times New Roman" w:eastAsia="Times New Roman" w:hAnsi="Times New Roman"/>
+          <w:b/>
+          <w:bCs/>
+          <w:sz w:val="26"/>
+          <w:szCs w:val="26"/>
+        </w:rPr>
+        <w:t xml:space="preserve">A. Các chủ thể</w:t>
+      </w:r>
+    </w:p>
+    <w:p>
+      <w:pPr>
         <w:spacing w:after="60" w:before="60" w:line="300"/>
         <w:ind w:firstLine="567"/>
         <w:jc w:val="both"/>
@@ -1742,7 +1760,7 @@
           <w:sz w:val="26"/>
           <w:szCs w:val="26"/>
         </w:rPr>
-        <w:t xml:space="preserve"> là người được Chủ đầu tư nêu ra trong Hợp đồng hoặc được ủy quyền theo từng thời gian và điều hành công việc thay mặt Chủ đầu tư.</w:t>
+        <w:t xml:space="preserve"> là người được Chủ đầu tư nêu ra trong Hợp đồng thầu chính hoặc được ủy quyền theo từng thời gian và điều hành công việc thay mặt Chủ đầu tư.</w:t>
       </w:r>
     </w:p>
     <w:p>
@@ -1775,7 +1793,7 @@
           <w:sz w:val="26"/>
           <w:szCs w:val="26"/>
         </w:rPr>
-        <w:t xml:space="preserve"> là người được Bên A nêu ra trong Hợp đồng hoặc được Bên A ủy quyền bằng văn bản và điều hành công việc thay mặt Bên A.</w:t>
+        <w:t xml:space="preserve"> là người được Bên A nêu ra trong Hợp đồng hoặc được Bên A ủy quyền bằng văn bản và điều hành công việc thay mặt Bên A. Chỉ những chỉ dẫn, chấp thuận bằng văn bản của Đại diện Bên A mới ràng buộc Bên A.</w:t>
       </w:r>
     </w:p>
     <w:p>
@@ -1800,15 +1818,15 @@
           <w:sz w:val="26"/>
           <w:szCs w:val="26"/>
         </w:rPr>
-        <w:t xml:space="preserve">Đại diện Bên B:</w:t>
-      </w:r>
-      <w:r>
-        <w:rPr>
-          <w:rFonts w:ascii="Times New Roman" w:cs="Times New Roman" w:eastAsia="Times New Roman" w:hAnsi="Times New Roman"/>
-          <w:sz w:val="26"/>
-          <w:szCs w:val="26"/>
-        </w:rPr>
-        <w:t xml:space="preserve"> là người được Bên B nêu ra trong Hợp đồng hoặc được Bên B ủy quyền bằng văn bản và điều hành công việc thay mặt Bên B.</w:t>
+        <w:t xml:space="preserve">Đại diện Bên B (Chỉ huy trưởng):</w:t>
+      </w:r>
+      <w:r>
+        <w:rPr>
+          <w:rFonts w:ascii="Times New Roman" w:cs="Times New Roman" w:eastAsia="Times New Roman" w:hAnsi="Times New Roman"/>
+          <w:sz w:val="26"/>
+          <w:szCs w:val="26"/>
+        </w:rPr>
+        <w:t xml:space="preserve"> là người được Bên B nêu ra trong Hợp đồng hoặc được Bên B ủy quyền bằng văn bản và điều hành công việc thay mặt Bên B theo Khoản 12.3.</w:t>
       </w:r>
     </w:p>
     <w:p>
@@ -1833,15 +1851,15 @@
           <w:sz w:val="26"/>
           <w:szCs w:val="26"/>
         </w:rPr>
-        <w:t xml:space="preserve">Tư vấn thiết kế/Tư vấn giám sát:</w:t>
-      </w:r>
-      <w:r>
-        <w:rPr>
-          <w:rFonts w:ascii="Times New Roman" w:cs="Times New Roman" w:eastAsia="Times New Roman" w:hAnsi="Times New Roman"/>
-          <w:sz w:val="26"/>
-          <w:szCs w:val="26"/>
-        </w:rPr>
-        <w:t xml:space="preserve"> là tổ chức thực hiện việc thiết kế/giám sát thi công xây dựng công trình theo hợp đồng với Chủ đầu tư.</w:t>
+        <w:t xml:space="preserve">Tư vấn:</w:t>
+      </w:r>
+      <w:r>
+        <w:rPr>
+          <w:rFonts w:ascii="Times New Roman" w:cs="Times New Roman" w:eastAsia="Times New Roman" w:hAnsi="Times New Roman"/>
+          <w:sz w:val="26"/>
+          <w:szCs w:val="26"/>
+        </w:rPr>
+        <w:t xml:space="preserve"> là các tổ chức, cá nhân được Chủ đầu tư thuê thực hiện tư vấn thiết kế, tư vấn giám sát, tư vấn quản lý dự án, kiểm định, thẩm tra cho Dự án.</w:t>
       </w:r>
     </w:p>
     <w:p>
@@ -1866,6 +1884,90 @@
           <w:sz w:val="26"/>
           <w:szCs w:val="26"/>
         </w:rPr>
+        <w:t xml:space="preserve">Người của Bên B:</w:t>
+      </w:r>
+      <w:r>
+        <w:rPr>
+          <w:rFonts w:ascii="Times New Roman" w:cs="Times New Roman" w:eastAsia="Times New Roman" w:hAnsi="Times New Roman"/>
+          <w:sz w:val="26"/>
+          <w:szCs w:val="26"/>
+        </w:rPr>
+        <w:t xml:space="preserve"> là Đại diện Bên B, cán bộ, công nhân, người lao động, tổ đội, nhà thầu phụ, nhà cung cấp do Bên B huy động hoặc thuê để thực hiện công việc. Mọi hành vi, lỗi của Người của Bên B được coi là hành vi, lỗi của Bên B.</w:t>
+      </w:r>
+    </w:p>
+    <w:p>
+      <w:pPr>
+        <w:spacing w:after="60" w:before="60" w:line="300"/>
+        <w:ind w:firstLine="567"/>
+        <w:jc w:val="both"/>
+      </w:pPr>
+      <w:r>
+        <w:rPr>
+          <w:rFonts w:ascii="Times New Roman" w:cs="Times New Roman" w:eastAsia="Times New Roman" w:hAnsi="Times New Roman"/>
+          <w:sz w:val="26"/>
+          <w:szCs w:val="26"/>
+        </w:rPr>
+        <w:t xml:space="preserve">1.9. </w:t>
+      </w:r>
+      <w:r>
+        <w:rPr>
+          <w:rFonts w:ascii="Times New Roman" w:cs="Times New Roman" w:eastAsia="Times New Roman" w:hAnsi="Times New Roman"/>
+          <w:b/>
+          <w:bCs/>
+          <w:sz w:val="26"/>
+          <w:szCs w:val="26"/>
+        </w:rPr>
+        <w:t xml:space="preserve">Nhà thầu khác:</w:t>
+      </w:r>
+      <w:r>
+        <w:rPr>
+          <w:rFonts w:ascii="Times New Roman" w:cs="Times New Roman" w:eastAsia="Times New Roman" w:hAnsi="Times New Roman"/>
+          <w:sz w:val="26"/>
+          <w:szCs w:val="26"/>
+        </w:rPr>
+        <w:t xml:space="preserve"> là các nhà thầu, đơn vị do Chủ đầu tư hoặc Bên A thuê thực hiện các công việc khác trên Công trường (phần ngầm, cơ điện, thang máy, mặt dựng, hoàn thiện khô…) không thuộc phạm vi Hợp đồng này.</w:t>
+      </w:r>
+    </w:p>
+    <w:p>
+      <w:pPr>
+        <w:keepNext/>
+        <w:spacing w:after="60" w:before="60" w:line="300"/>
+        <w:ind w:firstLine="567"/>
+        <w:jc w:val="both"/>
+      </w:pPr>
+      <w:r>
+        <w:rPr>
+          <w:rFonts w:ascii="Times New Roman" w:cs="Times New Roman" w:eastAsia="Times New Roman" w:hAnsi="Times New Roman"/>
+          <w:b/>
+          <w:bCs/>
+          <w:sz w:val="26"/>
+          <w:szCs w:val="26"/>
+        </w:rPr>
+        <w:t xml:space="preserve">B. Dự án, công trình, phạm vi</w:t>
+      </w:r>
+    </w:p>
+    <w:p>
+      <w:pPr>
+        <w:spacing w:after="60" w:before="60" w:line="300"/>
+        <w:ind w:firstLine="567"/>
+        <w:jc w:val="both"/>
+      </w:pPr>
+      <w:r>
+        <w:rPr>
+          <w:rFonts w:ascii="Times New Roman" w:cs="Times New Roman" w:eastAsia="Times New Roman" w:hAnsi="Times New Roman"/>
+          <w:sz w:val="26"/>
+          <w:szCs w:val="26"/>
+        </w:rPr>
+        <w:t xml:space="preserve">1.10. </w:t>
+      </w:r>
+      <w:r>
+        <w:rPr>
+          <w:rFonts w:ascii="Times New Roman" w:cs="Times New Roman" w:eastAsia="Times New Roman" w:hAnsi="Times New Roman"/>
+          <w:b/>
+          <w:bCs/>
+          <w:sz w:val="26"/>
+          <w:szCs w:val="26"/>
+        </w:rPr>
         <w:t xml:space="preserve">Dự án:</w:t>
       </w:r>
       <w:r>
@@ -1889,7 +1991,289 @@
           <w:sz w:val="26"/>
           <w:szCs w:val="26"/>
         </w:rPr>
-        <w:t xml:space="preserve">1.9. </w:t>
+        <w:t xml:space="preserve">1.11. </w:t>
+      </w:r>
+      <w:r>
+        <w:rPr>
+          <w:rFonts w:ascii="Times New Roman" w:cs="Times New Roman" w:eastAsia="Times New Roman" w:hAnsi="Times New Roman"/>
+          <w:b/>
+          <w:bCs/>
+          <w:sz w:val="26"/>
+          <w:szCs w:val="26"/>
+        </w:rPr>
+        <w:t xml:space="preserve">Công trình:</w:t>
+      </w:r>
+      <w:r>
+        <w:rPr>
+          <w:rFonts w:ascii="Times New Roman" w:cs="Times New Roman" w:eastAsia="Times New Roman" w:hAnsi="Times New Roman"/>
+          <w:sz w:val="26"/>
+          <w:szCs w:val="26"/>
+        </w:rPr>
+        <w:t xml:space="preserve"> là Nhà ở cho lực lượng vũ trang Công an nhân dân tại ô đất C3-ODK3 và C3-ODK4 thuộc phân khu đô thị H2-4, Phường Yên Sở, Thành phố Hà Nội.</w:t>
+      </w:r>
+    </w:p>
+    <w:p>
+      <w:pPr>
+        <w:spacing w:after="60" w:before="60" w:line="300"/>
+        <w:ind w:firstLine="567"/>
+        <w:jc w:val="both"/>
+      </w:pPr>
+      <w:r>
+        <w:rPr>
+          <w:rFonts w:ascii="Times New Roman" w:cs="Times New Roman" w:eastAsia="Times New Roman" w:hAnsi="Times New Roman"/>
+          <w:sz w:val="26"/>
+          <w:szCs w:val="26"/>
+        </w:rPr>
+        <w:t xml:space="preserve">1.12. </w:t>
+      </w:r>
+      <w:r>
+        <w:rPr>
+          <w:rFonts w:ascii="Times New Roman" w:cs="Times New Roman" w:eastAsia="Times New Roman" w:hAnsi="Times New Roman"/>
+          <w:b/>
+          <w:bCs/>
+          <w:sz w:val="26"/>
+          <w:szCs w:val="26"/>
+        </w:rPr>
+        <w:t xml:space="preserve">Khối nhà:</w:t>
+      </w:r>
+      <w:r>
+        <w:rPr>
+          <w:rFonts w:ascii="Times New Roman" w:cs="Times New Roman" w:eastAsia="Times New Roman" w:hAnsi="Times New Roman"/>
+          <w:sz w:val="26"/>
+          <w:szCs w:val="26"/>
+        </w:rPr>
+        <w:t xml:space="preserve"> là từng khối nhà ở xã hội CT1.2, CT2.1, CT2.2, CT2.3 thuộc phạm vi Hợp đồng.</w:t>
+      </w:r>
+    </w:p>
+    <w:p>
+      <w:pPr>
+        <w:spacing w:after="60" w:before="60" w:line="300"/>
+        <w:ind w:firstLine="567"/>
+        <w:jc w:val="both"/>
+      </w:pPr>
+      <w:r>
+        <w:rPr>
+          <w:rFonts w:ascii="Times New Roman" w:cs="Times New Roman" w:eastAsia="Times New Roman" w:hAnsi="Times New Roman"/>
+          <w:sz w:val="26"/>
+          <w:szCs w:val="26"/>
+        </w:rPr>
+        <w:t xml:space="preserve">1.13. </w:t>
+      </w:r>
+      <w:r>
+        <w:rPr>
+          <w:rFonts w:ascii="Times New Roman" w:cs="Times New Roman" w:eastAsia="Times New Roman" w:hAnsi="Times New Roman"/>
+          <w:b/>
+          <w:bCs/>
+          <w:sz w:val="26"/>
+          <w:szCs w:val="26"/>
+        </w:rPr>
+        <w:t xml:space="preserve">Hạng mục công trình:</w:t>
+      </w:r>
+      <w:r>
+        <w:rPr>
+          <w:rFonts w:ascii="Times New Roman" w:cs="Times New Roman" w:eastAsia="Times New Roman" w:hAnsi="Times New Roman"/>
+          <w:sz w:val="26"/>
+          <w:szCs w:val="26"/>
+        </w:rPr>
+        <w:t xml:space="preserve"> là Gói thầu P.001 – Thi công kết cấu phần thân và hoàn thiện ướt phần thân (chống thấm, xây, trát, ốp, lát, sơn, bả,..) cho khối nhà ở xã hội CT1.2 và CT2 (CT2.1, CT2.2 và CT2.3), bao gồm toàn bộ công việc Bên B phải thực hiện theo Hợp đồng.</w:t>
+      </w:r>
+    </w:p>
+    <w:p>
+      <w:pPr>
+        <w:spacing w:after="60" w:before="60" w:line="300"/>
+        <w:ind w:firstLine="567"/>
+        <w:jc w:val="both"/>
+      </w:pPr>
+      <w:r>
+        <w:rPr>
+          <w:rFonts w:ascii="Times New Roman" w:cs="Times New Roman" w:eastAsia="Times New Roman" w:hAnsi="Times New Roman"/>
+          <w:sz w:val="26"/>
+          <w:szCs w:val="26"/>
+        </w:rPr>
+        <w:t xml:space="preserve">1.14. </w:t>
+      </w:r>
+      <w:r>
+        <w:rPr>
+          <w:rFonts w:ascii="Times New Roman" w:cs="Times New Roman" w:eastAsia="Times New Roman" w:hAnsi="Times New Roman"/>
+          <w:b/>
+          <w:bCs/>
+          <w:sz w:val="26"/>
+          <w:szCs w:val="26"/>
+        </w:rPr>
+        <w:t xml:space="preserve">Phần thân:</w:t>
+      </w:r>
+      <w:r>
+        <w:rPr>
+          <w:rFonts w:ascii="Times New Roman" w:cs="Times New Roman" w:eastAsia="Times New Roman" w:hAnsi="Times New Roman"/>
+          <w:sz w:val="26"/>
+          <w:szCs w:val="26"/>
+        </w:rPr>
+        <w:t xml:space="preserve"> là toàn bộ các công việc kết cấu bê tông cốt thép từ trên cao độ ±0.00 (sau khi hoàn thành bê tông sàn tầng 1) đến hết kết cấu mái, tum thang, bể nước mái (cột, vách, lõi, dầm, sàn, cầu thang, lanh tô, giằng tường, ô văng, sê nô…) và công tác Hoàn thiện ướt các khu vực từ cao độ ±0.00 trở lên theo Hồ sơ thiết kế được duyệt. Ranh giới chi tiết theo Biểu 02 và Biểu 03.</w:t>
+      </w:r>
+    </w:p>
+    <w:p>
+      <w:pPr>
+        <w:spacing w:after="60" w:before="60" w:line="300"/>
+        <w:ind w:firstLine="567"/>
+        <w:jc w:val="both"/>
+      </w:pPr>
+      <w:r>
+        <w:rPr>
+          <w:rFonts w:ascii="Times New Roman" w:cs="Times New Roman" w:eastAsia="Times New Roman" w:hAnsi="Times New Roman"/>
+          <w:sz w:val="26"/>
+          <w:szCs w:val="26"/>
+        </w:rPr>
+        <w:t xml:space="preserve">1.15. </w:t>
+      </w:r>
+      <w:r>
+        <w:rPr>
+          <w:rFonts w:ascii="Times New Roman" w:cs="Times New Roman" w:eastAsia="Times New Roman" w:hAnsi="Times New Roman"/>
+          <w:b/>
+          <w:bCs/>
+          <w:sz w:val="26"/>
+          <w:szCs w:val="26"/>
+        </w:rPr>
+        <w:t xml:space="preserve">Phần ngầm:</w:t>
+      </w:r>
+      <w:r>
+        <w:rPr>
+          <w:rFonts w:ascii="Times New Roman" w:cs="Times New Roman" w:eastAsia="Times New Roman" w:hAnsi="Times New Roman"/>
+          <w:sz w:val="26"/>
+          <w:szCs w:val="26"/>
+        </w:rPr>
+        <w:t xml:space="preserve"> là công tác đất, cừ, văng chống, kết cấu phần ngầm đến cao độ ±0.00 và hoàn thiện ướt phần ngầm do Nhà thầu khác thực hiện, không thuộc phạm vi Hợp đồng này.</w:t>
+      </w:r>
+    </w:p>
+    <w:p>
+      <w:pPr>
+        <w:spacing w:after="60" w:before="60" w:line="300"/>
+        <w:ind w:firstLine="567"/>
+        <w:jc w:val="both"/>
+      </w:pPr>
+      <w:r>
+        <w:rPr>
+          <w:rFonts w:ascii="Times New Roman" w:cs="Times New Roman" w:eastAsia="Times New Roman" w:hAnsi="Times New Roman"/>
+          <w:sz w:val="26"/>
+          <w:szCs w:val="26"/>
+        </w:rPr>
+        <w:t xml:space="preserve">1.16. </w:t>
+      </w:r>
+      <w:r>
+        <w:rPr>
+          <w:rFonts w:ascii="Times New Roman" w:cs="Times New Roman" w:eastAsia="Times New Roman" w:hAnsi="Times New Roman"/>
+          <w:b/>
+          <w:bCs/>
+          <w:sz w:val="26"/>
+          <w:szCs w:val="26"/>
+        </w:rPr>
+        <w:t xml:space="preserve">Hoàn thiện ướt:</w:t>
+      </w:r>
+      <w:r>
+        <w:rPr>
+          <w:rFonts w:ascii="Times New Roman" w:cs="Times New Roman" w:eastAsia="Times New Roman" w:hAnsi="Times New Roman"/>
+          <w:sz w:val="26"/>
+          <w:szCs w:val="26"/>
+        </w:rPr>
+        <w:t xml:space="preserve"> là các công tác hoàn thiện có sử dụng vữa, nước hoặc vật liệu ướt, gồm: chống thấm, xây, trát, cán nền, ốp, lát, bả, sơn và các công việc tương tự theo Biểu 02.</w:t>
+      </w:r>
+    </w:p>
+    <w:p>
+      <w:pPr>
+        <w:spacing w:after="60" w:before="60" w:line="300"/>
+        <w:ind w:firstLine="567"/>
+        <w:jc w:val="both"/>
+      </w:pPr>
+      <w:r>
+        <w:rPr>
+          <w:rFonts w:ascii="Times New Roman" w:cs="Times New Roman" w:eastAsia="Times New Roman" w:hAnsi="Times New Roman"/>
+          <w:sz w:val="26"/>
+          <w:szCs w:val="26"/>
+        </w:rPr>
+        <w:t xml:space="preserve">1.17. </w:t>
+      </w:r>
+      <w:r>
+        <w:rPr>
+          <w:rFonts w:ascii="Times New Roman" w:cs="Times New Roman" w:eastAsia="Times New Roman" w:hAnsi="Times New Roman"/>
+          <w:b/>
+          <w:bCs/>
+          <w:sz w:val="26"/>
+          <w:szCs w:val="26"/>
+        </w:rPr>
+        <w:t xml:space="preserve">Công trường:</w:t>
+      </w:r>
+      <w:r>
+        <w:rPr>
+          <w:rFonts w:ascii="Times New Roman" w:cs="Times New Roman" w:eastAsia="Times New Roman" w:hAnsi="Times New Roman"/>
+          <w:sz w:val="26"/>
+          <w:szCs w:val="26"/>
+        </w:rPr>
+        <w:t xml:space="preserve"> là địa điểm Chủ đầu tư giao cho Bên A để thi công Công trình cũng như bất kỳ địa điểm nào khác được quy định trong Hợp đồng.</w:t>
+      </w:r>
+    </w:p>
+    <w:p>
+      <w:pPr>
+        <w:spacing w:after="60" w:before="60" w:line="300"/>
+        <w:ind w:firstLine="567"/>
+        <w:jc w:val="both"/>
+      </w:pPr>
+      <w:r>
+        <w:rPr>
+          <w:rFonts w:ascii="Times New Roman" w:cs="Times New Roman" w:eastAsia="Times New Roman" w:hAnsi="Times New Roman"/>
+          <w:sz w:val="26"/>
+          <w:szCs w:val="26"/>
+        </w:rPr>
+        <w:t xml:space="preserve">1.18. </w:t>
+      </w:r>
+      <w:r>
+        <w:rPr>
+          <w:rFonts w:ascii="Times New Roman" w:cs="Times New Roman" w:eastAsia="Times New Roman" w:hAnsi="Times New Roman"/>
+          <w:b/>
+          <w:bCs/>
+          <w:sz w:val="26"/>
+          <w:szCs w:val="26"/>
+        </w:rPr>
+        <w:t xml:space="preserve">Mặt bằng thi công:</w:t>
+      </w:r>
+      <w:r>
+        <w:rPr>
+          <w:rFonts w:ascii="Times New Roman" w:cs="Times New Roman" w:eastAsia="Times New Roman" w:hAnsi="Times New Roman"/>
+          <w:sz w:val="26"/>
+          <w:szCs w:val="26"/>
+        </w:rPr>
+        <w:t xml:space="preserve"> là khu vực, tầng, sàn được Bên A bàn giao cho Bên B bằng biên bản để thi công theo từng giai đoạn, kèm tim mốc, cao độ chuẩn.</w:t>
+      </w:r>
+    </w:p>
+    <w:p>
+      <w:pPr>
+        <w:keepNext/>
+        <w:spacing w:after="60" w:before="60" w:line="300"/>
+        <w:ind w:firstLine="567"/>
+        <w:jc w:val="both"/>
+      </w:pPr>
+      <w:r>
+        <w:rPr>
+          <w:rFonts w:ascii="Times New Roman" w:cs="Times New Roman" w:eastAsia="Times New Roman" w:hAnsi="Times New Roman"/>
+          <w:b/>
+          <w:bCs/>
+          <w:sz w:val="26"/>
+          <w:szCs w:val="26"/>
+        </w:rPr>
+        <w:t xml:space="preserve">C. Hồ sơ, tài liệu</w:t>
+      </w:r>
+    </w:p>
+    <w:p>
+      <w:pPr>
+        <w:spacing w:after="60" w:before="60" w:line="300"/>
+        <w:ind w:firstLine="567"/>
+        <w:jc w:val="both"/>
+      </w:pPr>
+      <w:r>
+        <w:rPr>
+          <w:rFonts w:ascii="Times New Roman" w:cs="Times New Roman" w:eastAsia="Times New Roman" w:hAnsi="Times New Roman"/>
+          <w:sz w:val="26"/>
+          <w:szCs w:val="26"/>
+        </w:rPr>
+        <w:t xml:space="preserve">1.19. </w:t>
       </w:r>
       <w:r>
         <w:rPr>
@@ -1907,22 +2291,154 @@
           <w:sz w:val="26"/>
           <w:szCs w:val="26"/>
         </w:rPr>
-        <w:t xml:space="preserve"> là toàn bộ hồ sơ hợp đồng theo quy định tại Điều 2 [Hồ sơ hợp đồng và thứ tự ưu tiên].</w:t>
-      </w:r>
-    </w:p>
-    <w:p>
-      <w:pPr>
-        <w:spacing w:after="60" w:before="60" w:line="300"/>
-        <w:ind w:firstLine="567"/>
-        <w:jc w:val="both"/>
-      </w:pPr>
-      <w:r>
-        <w:rPr>
-          <w:rFonts w:ascii="Times New Roman" w:cs="Times New Roman" w:eastAsia="Times New Roman" w:hAnsi="Times New Roman"/>
-          <w:sz w:val="26"/>
-          <w:szCs w:val="26"/>
-        </w:rPr>
-        <w:t xml:space="preserve">1.10. </w:t>
+        <w:t xml:space="preserve"> là văn bản Hợp đồng này cùng toàn bộ hồ sơ hợp đồng theo Điều 2 [Hồ sơ hợp đồng và thứ tự ưu tiên].</w:t>
+      </w:r>
+    </w:p>
+    <w:p>
+      <w:pPr>
+        <w:spacing w:after="60" w:before="60" w:line="300"/>
+        <w:ind w:firstLine="567"/>
+        <w:jc w:val="both"/>
+      </w:pPr>
+      <w:r>
+        <w:rPr>
+          <w:rFonts w:ascii="Times New Roman" w:cs="Times New Roman" w:eastAsia="Times New Roman" w:hAnsi="Times New Roman"/>
+          <w:sz w:val="26"/>
+          <w:szCs w:val="26"/>
+        </w:rPr>
+        <w:t xml:space="preserve">1.20. </w:t>
+      </w:r>
+      <w:r>
+        <w:rPr>
+          <w:rFonts w:ascii="Times New Roman" w:cs="Times New Roman" w:eastAsia="Times New Roman" w:hAnsi="Times New Roman"/>
+          <w:b/>
+          <w:bCs/>
+          <w:sz w:val="26"/>
+          <w:szCs w:val="26"/>
+        </w:rPr>
+        <w:t xml:space="preserve">Phụ lục hợp đồng:</w:t>
+      </w:r>
+      <w:r>
+        <w:rPr>
+          <w:rFonts w:ascii="Times New Roman" w:cs="Times New Roman" w:eastAsia="Times New Roman" w:hAnsi="Times New Roman"/>
+          <w:sz w:val="26"/>
+          <w:szCs w:val="26"/>
+        </w:rPr>
+        <w:t xml:space="preserve"> là văn bản do người đại diện có thẩm quyền của Hai Bên ký để sửa đổi, bổ sung Hợp đồng; là bộ phận không tách rời của Hợp đồng.</w:t>
+      </w:r>
+    </w:p>
+    <w:p>
+      <w:pPr>
+        <w:spacing w:after="60" w:before="60" w:line="300"/>
+        <w:ind w:firstLine="567"/>
+        <w:jc w:val="both"/>
+      </w:pPr>
+      <w:r>
+        <w:rPr>
+          <w:rFonts w:ascii="Times New Roman" w:cs="Times New Roman" w:eastAsia="Times New Roman" w:hAnsi="Times New Roman"/>
+          <w:sz w:val="26"/>
+          <w:szCs w:val="26"/>
+        </w:rPr>
+        <w:t xml:space="preserve">1.21. </w:t>
+      </w:r>
+      <w:r>
+        <w:rPr>
+          <w:rFonts w:ascii="Times New Roman" w:cs="Times New Roman" w:eastAsia="Times New Roman" w:hAnsi="Times New Roman"/>
+          <w:b/>
+          <w:bCs/>
+          <w:sz w:val="26"/>
+          <w:szCs w:val="26"/>
+        </w:rPr>
+        <w:t xml:space="preserve">Hợp đồng thầu chính:</w:t>
+      </w:r>
+      <w:r>
+        <w:rPr>
+          <w:rFonts w:ascii="Times New Roman" w:cs="Times New Roman" w:eastAsia="Times New Roman" w:hAnsi="Times New Roman"/>
+          <w:sz w:val="26"/>
+          <w:szCs w:val="26"/>
+        </w:rPr>
+        <w:t xml:space="preserve"> là hợp đồng giữa Bên A (thành viên Liên danh nhà thầu) và Chủ đầu tư về việc thực hiện Dự án, bao gồm các phụ lục, sửa đổi, bổ sung.</w:t>
+      </w:r>
+    </w:p>
+    <w:p>
+      <w:pPr>
+        <w:spacing w:after="60" w:before="60" w:line="300"/>
+        <w:ind w:firstLine="567"/>
+        <w:jc w:val="both"/>
+      </w:pPr>
+      <w:r>
+        <w:rPr>
+          <w:rFonts w:ascii="Times New Roman" w:cs="Times New Roman" w:eastAsia="Times New Roman" w:hAnsi="Times New Roman"/>
+          <w:sz w:val="26"/>
+          <w:szCs w:val="26"/>
+        </w:rPr>
+        <w:t xml:space="preserve">1.22. </w:t>
+      </w:r>
+      <w:r>
+        <w:rPr>
+          <w:rFonts w:ascii="Times New Roman" w:cs="Times New Roman" w:eastAsia="Times New Roman" w:hAnsi="Times New Roman"/>
+          <w:b/>
+          <w:bCs/>
+          <w:sz w:val="26"/>
+          <w:szCs w:val="26"/>
+        </w:rPr>
+        <w:t xml:space="preserve">Hồ sơ thiết kế:</w:t>
+      </w:r>
+      <w:r>
+        <w:rPr>
+          <w:rFonts w:ascii="Times New Roman" w:cs="Times New Roman" w:eastAsia="Times New Roman" w:hAnsi="Times New Roman"/>
+          <w:sz w:val="26"/>
+          <w:szCs w:val="26"/>
+        </w:rPr>
+        <w:t xml:space="preserve"> là hồ sơ thiết kế kỹ thuật, thiết kế bản vẽ thi công được cấp có thẩm quyền phê duyệt, bao gồm cả các bản vẽ sửa đổi, bổ sung được phê duyệt trong quá trình thi công.</w:t>
+      </w:r>
+    </w:p>
+    <w:p>
+      <w:pPr>
+        <w:spacing w:after="60" w:before="60" w:line="300"/>
+        <w:ind w:firstLine="567"/>
+        <w:jc w:val="both"/>
+      </w:pPr>
+      <w:r>
+        <w:rPr>
+          <w:rFonts w:ascii="Times New Roman" w:cs="Times New Roman" w:eastAsia="Times New Roman" w:hAnsi="Times New Roman"/>
+          <w:sz w:val="26"/>
+          <w:szCs w:val="26"/>
+        </w:rPr>
+        <w:t xml:space="preserve">1.23. </w:t>
+      </w:r>
+      <w:r>
+        <w:rPr>
+          <w:rFonts w:ascii="Times New Roman" w:cs="Times New Roman" w:eastAsia="Times New Roman" w:hAnsi="Times New Roman"/>
+          <w:b/>
+          <w:bCs/>
+          <w:sz w:val="26"/>
+          <w:szCs w:val="26"/>
+        </w:rPr>
+        <w:t xml:space="preserve">Bản vẽ triển khai (shop drawing):</w:t>
+      </w:r>
+      <w:r>
+        <w:rPr>
+          <w:rFonts w:ascii="Times New Roman" w:cs="Times New Roman" w:eastAsia="Times New Roman" w:hAnsi="Times New Roman"/>
+          <w:sz w:val="26"/>
+          <w:szCs w:val="26"/>
+        </w:rPr>
+        <w:t xml:space="preserve"> là bản vẽ chi tiết do Bên B lập trên cơ sở Hồ sơ thiết kế để thi công (bố trí thép, ván khuôn, mạch ngừng, bố trí gạch, ốp lát, chi tiết chờ…), phải được Bên A, Tư vấn chấp thuận trước khi thi công.</w:t>
+      </w:r>
+    </w:p>
+    <w:p>
+      <w:pPr>
+        <w:spacing w:after="60" w:before="60" w:line="300"/>
+        <w:ind w:firstLine="567"/>
+        <w:jc w:val="both"/>
+      </w:pPr>
+      <w:r>
+        <w:rPr>
+          <w:rFonts w:ascii="Times New Roman" w:cs="Times New Roman" w:eastAsia="Times New Roman" w:hAnsi="Times New Roman"/>
+          <w:sz w:val="26"/>
+          <w:szCs w:val="26"/>
+        </w:rPr>
+        <w:t xml:space="preserve">1.24. </w:t>
       </w:r>
       <w:r>
         <w:rPr>
@@ -1955,106 +2471,106 @@
           <w:sz w:val="26"/>
           <w:szCs w:val="26"/>
         </w:rPr>
-        <w:t xml:space="preserve">1.11. </w:t>
-      </w:r>
-      <w:r>
-        <w:rPr>
-          <w:rFonts w:ascii="Times New Roman" w:cs="Times New Roman" w:eastAsia="Times New Roman" w:hAnsi="Times New Roman"/>
-          <w:b/>
-          <w:bCs/>
-          <w:sz w:val="26"/>
-          <w:szCs w:val="26"/>
-        </w:rPr>
-        <w:t xml:space="preserve">Hồ sơ thiết kế:</w:t>
-      </w:r>
-      <w:r>
-        <w:rPr>
-          <w:rFonts w:ascii="Times New Roman" w:cs="Times New Roman" w:eastAsia="Times New Roman" w:hAnsi="Times New Roman"/>
-          <w:sz w:val="26"/>
-          <w:szCs w:val="26"/>
-        </w:rPr>
-        <w:t xml:space="preserve"> là hồ sơ thiết kế kỹ thuật, thiết kế bản vẽ thi công xây dựng công trình được cấp có thẩm quyền phê duyệt, bao gồm cả các bản vẽ sửa đổi, bổ sung được phê duyệt trong quá trình thi công.</w:t>
-      </w:r>
-    </w:p>
-    <w:p>
-      <w:pPr>
-        <w:spacing w:after="60" w:before="60" w:line="300"/>
-        <w:ind w:firstLine="567"/>
-        <w:jc w:val="both"/>
-      </w:pPr>
-      <w:r>
-        <w:rPr>
-          <w:rFonts w:ascii="Times New Roman" w:cs="Times New Roman" w:eastAsia="Times New Roman" w:hAnsi="Times New Roman"/>
-          <w:sz w:val="26"/>
-          <w:szCs w:val="26"/>
-        </w:rPr>
-        <w:t xml:space="preserve">1.12. </w:t>
-      </w:r>
-      <w:r>
-        <w:rPr>
-          <w:rFonts w:ascii="Times New Roman" w:cs="Times New Roman" w:eastAsia="Times New Roman" w:hAnsi="Times New Roman"/>
-          <w:b/>
-          <w:bCs/>
-          <w:sz w:val="26"/>
-          <w:szCs w:val="26"/>
-        </w:rPr>
-        <w:t xml:space="preserve">Hợp đồng Chủ đầu tư:</w:t>
-      </w:r>
-      <w:r>
-        <w:rPr>
-          <w:rFonts w:ascii="Times New Roman" w:cs="Times New Roman" w:eastAsia="Times New Roman" w:hAnsi="Times New Roman"/>
-          <w:sz w:val="26"/>
-          <w:szCs w:val="26"/>
-        </w:rPr>
-        <w:t xml:space="preserve"> là hợp đồng giữa Bên A và Liên danh Chủ đầu tư Công ty CP Đầu tư Tài chính và An ninh Công nghệ IFT và Công ty TNHH Phát triển Tiền Phong (sau đây gọi là “Hợp đồng thầu chính”).</w:t>
-      </w:r>
-    </w:p>
-    <w:p>
-      <w:pPr>
-        <w:spacing w:after="60" w:before="60" w:line="300"/>
-        <w:ind w:firstLine="567"/>
-        <w:jc w:val="both"/>
-      </w:pPr>
-      <w:r>
-        <w:rPr>
-          <w:rFonts w:ascii="Times New Roman" w:cs="Times New Roman" w:eastAsia="Times New Roman" w:hAnsi="Times New Roman"/>
-          <w:sz w:val="26"/>
-          <w:szCs w:val="26"/>
-        </w:rPr>
-        <w:t xml:space="preserve">1.13. </w:t>
-      </w:r>
-      <w:r>
-        <w:rPr>
-          <w:rFonts w:ascii="Times New Roman" w:cs="Times New Roman" w:eastAsia="Times New Roman" w:hAnsi="Times New Roman"/>
-          <w:b/>
-          <w:bCs/>
-          <w:sz w:val="26"/>
-          <w:szCs w:val="26"/>
-        </w:rPr>
-        <w:t xml:space="preserve">Bảng tiên lượng:</w:t>
-      </w:r>
-      <w:r>
-        <w:rPr>
-          <w:rFonts w:ascii="Times New Roman" w:cs="Times New Roman" w:eastAsia="Times New Roman" w:hAnsi="Times New Roman"/>
-          <w:sz w:val="26"/>
-          <w:szCs w:val="26"/>
-        </w:rPr>
-        <w:t xml:space="preserve"> là bảng kê chi tiết khối lượng và giá các công việc trong Hợp đồng.</w:t>
-      </w:r>
-    </w:p>
-    <w:p>
-      <w:pPr>
-        <w:spacing w:after="60" w:before="60" w:line="300"/>
-        <w:ind w:firstLine="567"/>
-        <w:jc w:val="both"/>
-      </w:pPr>
-      <w:r>
-        <w:rPr>
-          <w:rFonts w:ascii="Times New Roman" w:cs="Times New Roman" w:eastAsia="Times New Roman" w:hAnsi="Times New Roman"/>
-          <w:sz w:val="26"/>
-          <w:szCs w:val="26"/>
-        </w:rPr>
-        <w:t xml:space="preserve">1.14. </w:t>
+        <w:t xml:space="preserve">1.25. </w:t>
+      </w:r>
+      <w:r>
+        <w:rPr>
+          <w:rFonts w:ascii="Times New Roman" w:cs="Times New Roman" w:eastAsia="Times New Roman" w:hAnsi="Times New Roman"/>
+          <w:b/>
+          <w:bCs/>
+          <w:sz w:val="26"/>
+          <w:szCs w:val="26"/>
+        </w:rPr>
+        <w:t xml:space="preserve">Biện pháp thi công:</w:t>
+      </w:r>
+      <w:r>
+        <w:rPr>
+          <w:rFonts w:ascii="Times New Roman" w:cs="Times New Roman" w:eastAsia="Times New Roman" w:hAnsi="Times New Roman"/>
+          <w:sz w:val="26"/>
+          <w:szCs w:val="26"/>
+        </w:rPr>
+        <w:t xml:space="preserve"> là hồ sơ biện pháp tổ chức, kỹ thuật, an toàn thi công do Bên B lập và được Bên A phê duyệt theo Khoản 5.2.</w:t>
+      </w:r>
+    </w:p>
+    <w:p>
+      <w:pPr>
+        <w:spacing w:after="60" w:before="60" w:line="300"/>
+        <w:ind w:firstLine="567"/>
+        <w:jc w:val="both"/>
+      </w:pPr>
+      <w:r>
+        <w:rPr>
+          <w:rFonts w:ascii="Times New Roman" w:cs="Times New Roman" w:eastAsia="Times New Roman" w:hAnsi="Times New Roman"/>
+          <w:sz w:val="26"/>
+          <w:szCs w:val="26"/>
+        </w:rPr>
+        <w:t xml:space="preserve">1.26. </w:t>
+      </w:r>
+      <w:r>
+        <w:rPr>
+          <w:rFonts w:ascii="Times New Roman" w:cs="Times New Roman" w:eastAsia="Times New Roman" w:hAnsi="Times New Roman"/>
+          <w:b/>
+          <w:bCs/>
+          <w:sz w:val="26"/>
+          <w:szCs w:val="26"/>
+        </w:rPr>
+        <w:t xml:space="preserve">Mẫu (mock-up):</w:t>
+      </w:r>
+      <w:r>
+        <w:rPr>
+          <w:rFonts w:ascii="Times New Roman" w:cs="Times New Roman" w:eastAsia="Times New Roman" w:hAnsi="Times New Roman"/>
+          <w:sz w:val="26"/>
+          <w:szCs w:val="26"/>
+        </w:rPr>
+        <w:t xml:space="preserve"> là sản phẩm thi công thử của từng loại công tác Hoàn thiện ướt, được Bên A, Chủ đầu tư phê duyệt làm chuẩn nghiệm thu.</w:t>
+      </w:r>
+    </w:p>
+    <w:p>
+      <w:pPr>
+        <w:spacing w:after="60" w:before="60" w:line="300"/>
+        <w:ind w:firstLine="567"/>
+        <w:jc w:val="both"/>
+      </w:pPr>
+      <w:r>
+        <w:rPr>
+          <w:rFonts w:ascii="Times New Roman" w:cs="Times New Roman" w:eastAsia="Times New Roman" w:hAnsi="Times New Roman"/>
+          <w:sz w:val="26"/>
+          <w:szCs w:val="26"/>
+        </w:rPr>
+        <w:t xml:space="preserve">1.27. </w:t>
+      </w:r>
+      <w:r>
+        <w:rPr>
+          <w:rFonts w:ascii="Times New Roman" w:cs="Times New Roman" w:eastAsia="Times New Roman" w:hAnsi="Times New Roman"/>
+          <w:b/>
+          <w:bCs/>
+          <w:sz w:val="26"/>
+          <w:szCs w:val="26"/>
+        </w:rPr>
+        <w:t xml:space="preserve">Hồ sơ hoàn công:</w:t>
+      </w:r>
+      <w:r>
+        <w:rPr>
+          <w:rFonts w:ascii="Times New Roman" w:cs="Times New Roman" w:eastAsia="Times New Roman" w:hAnsi="Times New Roman"/>
+          <w:sz w:val="26"/>
+          <w:szCs w:val="26"/>
+        </w:rPr>
+        <w:t xml:space="preserve"> là tập hợp hồ sơ, tài liệu có liên quan tới quá trình thi công Hạng mục công trình được lập theo quy định của pháp luật về xây dựng, Hợp đồng thầu chính, yêu cầu của Chủ đầu tư và cơ quan có thẩm quyền.</w:t>
+      </w:r>
+    </w:p>
+    <w:p>
+      <w:pPr>
+        <w:spacing w:after="60" w:before="60" w:line="300"/>
+        <w:ind w:firstLine="567"/>
+        <w:jc w:val="both"/>
+      </w:pPr>
+      <w:r>
+        <w:rPr>
+          <w:rFonts w:ascii="Times New Roman" w:cs="Times New Roman" w:eastAsia="Times New Roman" w:hAnsi="Times New Roman"/>
+          <w:sz w:val="26"/>
+          <w:szCs w:val="26"/>
+        </w:rPr>
+        <w:t xml:space="preserve">1.28. </w:t>
       </w:r>
       <w:r>
         <w:rPr>
@@ -2072,22 +2588,73 @@
           <w:sz w:val="26"/>
           <w:szCs w:val="26"/>
         </w:rPr>
-        <w:t xml:space="preserve"> là biên bản được phát hành theo Điều 6 [Nghiệm thu và bàn giao Hạng mục công trình].</w:t>
-      </w:r>
-    </w:p>
-    <w:p>
-      <w:pPr>
-        <w:spacing w:after="60" w:before="60" w:line="300"/>
-        <w:ind w:firstLine="567"/>
-        <w:jc w:val="both"/>
-      </w:pPr>
-      <w:r>
-        <w:rPr>
-          <w:rFonts w:ascii="Times New Roman" w:cs="Times New Roman" w:eastAsia="Times New Roman" w:hAnsi="Times New Roman"/>
-          <w:sz w:val="26"/>
-          <w:szCs w:val="26"/>
-        </w:rPr>
-        <w:t xml:space="preserve">1.15. </w:t>
+        <w:t xml:space="preserve"> là biên bản được lập theo Điều 6 [Nghiệm thu và bàn giao Hạng mục công trình].</w:t>
+      </w:r>
+    </w:p>
+    <w:p>
+      <w:pPr>
+        <w:spacing w:after="60" w:before="60" w:line="300"/>
+        <w:ind w:firstLine="567"/>
+        <w:jc w:val="both"/>
+      </w:pPr>
+      <w:r>
+        <w:rPr>
+          <w:rFonts w:ascii="Times New Roman" w:cs="Times New Roman" w:eastAsia="Times New Roman" w:hAnsi="Times New Roman"/>
+          <w:sz w:val="26"/>
+          <w:szCs w:val="26"/>
+        </w:rPr>
+        <w:t xml:space="preserve">1.29. </w:t>
+      </w:r>
+      <w:r>
+        <w:rPr>
+          <w:rFonts w:ascii="Times New Roman" w:cs="Times New Roman" w:eastAsia="Times New Roman" w:hAnsi="Times New Roman"/>
+          <w:b/>
+          <w:bCs/>
+          <w:sz w:val="26"/>
+          <w:szCs w:val="26"/>
+        </w:rPr>
+        <w:t xml:space="preserve">Văn bản:</w:t>
+      </w:r>
+      <w:r>
+        <w:rPr>
+          <w:rFonts w:ascii="Times New Roman" w:cs="Times New Roman" w:eastAsia="Times New Roman" w:hAnsi="Times New Roman"/>
+          <w:sz w:val="26"/>
+          <w:szCs w:val="26"/>
+        </w:rPr>
+        <w:t xml:space="preserve"> là tài liệu bằng giấy có chữ ký (và đóng dấu, nếu có) của người có thẩm quyền, hoặc thư điện tử gửi từ/đến địa chỉ đã được Hai Bên đăng ký theo Khoản 3.6.</w:t>
+      </w:r>
+    </w:p>
+    <w:p>
+      <w:pPr>
+        <w:keepNext/>
+        <w:spacing w:after="60" w:before="60" w:line="300"/>
+        <w:ind w:firstLine="567"/>
+        <w:jc w:val="both"/>
+      </w:pPr>
+      <w:r>
+        <w:rPr>
+          <w:rFonts w:ascii="Times New Roman" w:cs="Times New Roman" w:eastAsia="Times New Roman" w:hAnsi="Times New Roman"/>
+          <w:b/>
+          <w:bCs/>
+          <w:sz w:val="26"/>
+          <w:szCs w:val="26"/>
+        </w:rPr>
+        <w:t xml:space="preserve">D. Tiến độ, thời gian</w:t>
+      </w:r>
+    </w:p>
+    <w:p>
+      <w:pPr>
+        <w:spacing w:after="60" w:before="60" w:line="300"/>
+        <w:ind w:firstLine="567"/>
+        <w:jc w:val="both"/>
+      </w:pPr>
+      <w:r>
+        <w:rPr>
+          <w:rFonts w:ascii="Times New Roman" w:cs="Times New Roman" w:eastAsia="Times New Roman" w:hAnsi="Times New Roman"/>
+          <w:sz w:val="26"/>
+          <w:szCs w:val="26"/>
+        </w:rPr>
+        <w:t xml:space="preserve">1.30. </w:t>
       </w:r>
       <w:r>
         <w:rPr>
@@ -2105,7 +2672,7 @@
           <w:sz w:val="26"/>
           <w:szCs w:val="26"/>
         </w:rPr>
-        <w:t xml:space="preserve"> được hiểu là ngày dương lịch; </w:t>
+        <w:t xml:space="preserve"> là ngày dương lịch; </w:t>
       </w:r>
       <w:r>
         <w:rPr>
@@ -2123,22 +2690,472 @@
           <w:sz w:val="26"/>
           <w:szCs w:val="26"/>
         </w:rPr>
-        <w:t xml:space="preserve"> được hiểu là tháng dương lịch.</w:t>
-      </w:r>
-    </w:p>
-    <w:p>
-      <w:pPr>
-        <w:spacing w:after="60" w:before="60" w:line="300"/>
-        <w:ind w:firstLine="567"/>
-        <w:jc w:val="both"/>
-      </w:pPr>
-      <w:r>
-        <w:rPr>
-          <w:rFonts w:ascii="Times New Roman" w:cs="Times New Roman" w:eastAsia="Times New Roman" w:hAnsi="Times New Roman"/>
-          <w:sz w:val="26"/>
-          <w:szCs w:val="26"/>
-        </w:rPr>
-        <w:t xml:space="preserve">1.16. </w:t>
+        <w:t xml:space="preserve"> là tháng dương lịch. </w:t>
+      </w:r>
+      <w:r>
+        <w:rPr>
+          <w:rFonts w:ascii="Times New Roman" w:cs="Times New Roman" w:eastAsia="Times New Roman" w:hAnsi="Times New Roman"/>
+          <w:b/>
+          <w:bCs/>
+          <w:sz w:val="26"/>
+          <w:szCs w:val="26"/>
+        </w:rPr>
+        <w:t xml:space="preserve">Ngày làm việc</w:t>
+      </w:r>
+      <w:r>
+        <w:rPr>
+          <w:rFonts w:ascii="Times New Roman" w:cs="Times New Roman" w:eastAsia="Times New Roman" w:hAnsi="Times New Roman"/>
+          <w:sz w:val="26"/>
+          <w:szCs w:val="26"/>
+        </w:rPr>
+        <w:t xml:space="preserve"> là các ngày từ thứ Hai đến thứ Sáu, trừ ngày nghỉ lễ, Tết theo quy định của pháp luật.</w:t>
+      </w:r>
+    </w:p>
+    <w:p>
+      <w:pPr>
+        <w:spacing w:after="60" w:before="60" w:line="300"/>
+        <w:ind w:firstLine="567"/>
+        <w:jc w:val="both"/>
+      </w:pPr>
+      <w:r>
+        <w:rPr>
+          <w:rFonts w:ascii="Times New Roman" w:cs="Times New Roman" w:eastAsia="Times New Roman" w:hAnsi="Times New Roman"/>
+          <w:sz w:val="26"/>
+          <w:szCs w:val="26"/>
+        </w:rPr>
+        <w:t xml:space="preserve">1.31. </w:t>
+      </w:r>
+      <w:r>
+        <w:rPr>
+          <w:rFonts w:ascii="Times New Roman" w:cs="Times New Roman" w:eastAsia="Times New Roman" w:hAnsi="Times New Roman"/>
+          <w:b/>
+          <w:bCs/>
+          <w:sz w:val="26"/>
+          <w:szCs w:val="26"/>
+        </w:rPr>
+        <w:t xml:space="preserve">Tiến độ chi tiết:</w:t>
+      </w:r>
+      <w:r>
+        <w:rPr>
+          <w:rFonts w:ascii="Times New Roman" w:cs="Times New Roman" w:eastAsia="Times New Roman" w:hAnsi="Times New Roman"/>
+          <w:sz w:val="26"/>
+          <w:szCs w:val="26"/>
+        </w:rPr>
+        <w:t xml:space="preserve"> là tiến độ thi công do Bên B lập trên cơ sở các mốc tiến độ tại Khoản 7.1 và Biểu 08, được Bên A chấp thuận bằng văn bản, kể cả các bản sửa đổi được chấp thuận.</w:t>
+      </w:r>
+    </w:p>
+    <w:p>
+      <w:pPr>
+        <w:spacing w:after="60" w:before="60" w:line="300"/>
+        <w:ind w:firstLine="567"/>
+        <w:jc w:val="both"/>
+      </w:pPr>
+      <w:r>
+        <w:rPr>
+          <w:rFonts w:ascii="Times New Roman" w:cs="Times New Roman" w:eastAsia="Times New Roman" w:hAnsi="Times New Roman"/>
+          <w:sz w:val="26"/>
+          <w:szCs w:val="26"/>
+        </w:rPr>
+        <w:t xml:space="preserve">1.32. </w:t>
+      </w:r>
+      <w:r>
+        <w:rPr>
+          <w:rFonts w:ascii="Times New Roman" w:cs="Times New Roman" w:eastAsia="Times New Roman" w:hAnsi="Times New Roman"/>
+          <w:b/>
+          <w:bCs/>
+          <w:sz w:val="26"/>
+          <w:szCs w:val="26"/>
+        </w:rPr>
+        <w:t xml:space="preserve">Chu kỳ sàn:</w:t>
+      </w:r>
+      <w:r>
+        <w:rPr>
+          <w:rFonts w:ascii="Times New Roman" w:cs="Times New Roman" w:eastAsia="Times New Roman" w:hAnsi="Times New Roman"/>
+          <w:sz w:val="26"/>
+          <w:szCs w:val="26"/>
+        </w:rPr>
+        <w:t xml:space="preserve"> là khoảng thời gian tính từ ngày hoàn thành đổ bê tông sàn tầng dưới đến ngày hoàn thành đổ bê tông sàn tầng liền kề phía trên.</w:t>
+      </w:r>
+    </w:p>
+    <w:p>
+      <w:pPr>
+        <w:spacing w:after="60" w:before="60" w:line="300"/>
+        <w:ind w:firstLine="567"/>
+        <w:jc w:val="both"/>
+      </w:pPr>
+      <w:r>
+        <w:rPr>
+          <w:rFonts w:ascii="Times New Roman" w:cs="Times New Roman" w:eastAsia="Times New Roman" w:hAnsi="Times New Roman"/>
+          <w:sz w:val="26"/>
+          <w:szCs w:val="26"/>
+        </w:rPr>
+        <w:t xml:space="preserve">1.33. </w:t>
+      </w:r>
+      <w:r>
+        <w:rPr>
+          <w:rFonts w:ascii="Times New Roman" w:cs="Times New Roman" w:eastAsia="Times New Roman" w:hAnsi="Times New Roman"/>
+          <w:b/>
+          <w:bCs/>
+          <w:sz w:val="26"/>
+          <w:szCs w:val="26"/>
+        </w:rPr>
+        <w:t xml:space="preserve">Đường găng:</w:t>
+      </w:r>
+      <w:r>
+        <w:rPr>
+          <w:rFonts w:ascii="Times New Roman" w:cs="Times New Roman" w:eastAsia="Times New Roman" w:hAnsi="Times New Roman"/>
+          <w:sz w:val="26"/>
+          <w:szCs w:val="26"/>
+        </w:rPr>
+        <w:t xml:space="preserve"> là chuỗi công việc trong Tiến độ chi tiết mà việc chậm trễ của bất kỳ công việc nào trong chuỗi sẽ làm chậm mốc hoàn thành tương ứng.</w:t>
+      </w:r>
+    </w:p>
+    <w:p>
+      <w:pPr>
+        <w:spacing w:after="60" w:before="60" w:line="300"/>
+        <w:ind w:firstLine="567"/>
+        <w:jc w:val="both"/>
+      </w:pPr>
+      <w:r>
+        <w:rPr>
+          <w:rFonts w:ascii="Times New Roman" w:cs="Times New Roman" w:eastAsia="Times New Roman" w:hAnsi="Times New Roman"/>
+          <w:sz w:val="26"/>
+          <w:szCs w:val="26"/>
+        </w:rPr>
+        <w:t xml:space="preserve">1.34. </w:t>
+      </w:r>
+      <w:r>
+        <w:rPr>
+          <w:rFonts w:ascii="Times New Roman" w:cs="Times New Roman" w:eastAsia="Times New Roman" w:hAnsi="Times New Roman"/>
+          <w:b/>
+          <w:bCs/>
+          <w:sz w:val="26"/>
+          <w:szCs w:val="26"/>
+        </w:rPr>
+        <w:t xml:space="preserve">Ngày hoàn thành:</w:t>
+      </w:r>
+      <w:r>
+        <w:rPr>
+          <w:rFonts w:ascii="Times New Roman" w:cs="Times New Roman" w:eastAsia="Times New Roman" w:hAnsi="Times New Roman"/>
+          <w:sz w:val="26"/>
+          <w:szCs w:val="26"/>
+        </w:rPr>
+        <w:t xml:space="preserve"> là ngày Hạng mục công trình (hoặc phần việc tương ứng với một mốc tiến độ) được Bên A ký Biên bản nghiệm thu hoàn thành theo Điều 6.</w:t>
+      </w:r>
+    </w:p>
+    <w:p>
+      <w:pPr>
+        <w:spacing w:after="60" w:before="60" w:line="300"/>
+        <w:ind w:firstLine="567"/>
+        <w:jc w:val="both"/>
+      </w:pPr>
+      <w:r>
+        <w:rPr>
+          <w:rFonts w:ascii="Times New Roman" w:cs="Times New Roman" w:eastAsia="Times New Roman" w:hAnsi="Times New Roman"/>
+          <w:sz w:val="26"/>
+          <w:szCs w:val="26"/>
+        </w:rPr>
+        <w:t xml:space="preserve">1.35. </w:t>
+      </w:r>
+      <w:r>
+        <w:rPr>
+          <w:rFonts w:ascii="Times New Roman" w:cs="Times New Roman" w:eastAsia="Times New Roman" w:hAnsi="Times New Roman"/>
+          <w:b/>
+          <w:bCs/>
+          <w:sz w:val="26"/>
+          <w:szCs w:val="26"/>
+        </w:rPr>
+        <w:t xml:space="preserve">Thời hạn bảo hành:</w:t>
+      </w:r>
+      <w:r>
+        <w:rPr>
+          <w:rFonts w:ascii="Times New Roman" w:cs="Times New Roman" w:eastAsia="Times New Roman" w:hAnsi="Times New Roman"/>
+          <w:sz w:val="26"/>
+          <w:szCs w:val="26"/>
+        </w:rPr>
+        <w:t xml:space="preserve"> là khoảng thời gian quy định tại Khoản 8.2, trong đó Bên B có nghĩa vụ sửa chữa Sai sót của Hạng mục công trình.</w:t>
+      </w:r>
+    </w:p>
+    <w:p>
+      <w:pPr>
+        <w:keepNext/>
+        <w:spacing w:after="60" w:before="60" w:line="300"/>
+        <w:ind w:firstLine="567"/>
+        <w:jc w:val="both"/>
+      </w:pPr>
+      <w:r>
+        <w:rPr>
+          <w:rFonts w:ascii="Times New Roman" w:cs="Times New Roman" w:eastAsia="Times New Roman" w:hAnsi="Times New Roman"/>
+          <w:b/>
+          <w:bCs/>
+          <w:sz w:val="26"/>
+          <w:szCs w:val="26"/>
+        </w:rPr>
+        <w:t xml:space="preserve">E. Giá, thanh toán</w:t>
+      </w:r>
+    </w:p>
+    <w:p>
+      <w:pPr>
+        <w:spacing w:after="60" w:before="60" w:line="300"/>
+        <w:ind w:firstLine="567"/>
+        <w:jc w:val="both"/>
+      </w:pPr>
+      <w:r>
+        <w:rPr>
+          <w:rFonts w:ascii="Times New Roman" w:cs="Times New Roman" w:eastAsia="Times New Roman" w:hAnsi="Times New Roman"/>
+          <w:sz w:val="26"/>
+          <w:szCs w:val="26"/>
+        </w:rPr>
+        <w:t xml:space="preserve">1.36. </w:t>
+      </w:r>
+      <w:r>
+        <w:rPr>
+          <w:rFonts w:ascii="Times New Roman" w:cs="Times New Roman" w:eastAsia="Times New Roman" w:hAnsi="Times New Roman"/>
+          <w:b/>
+          <w:bCs/>
+          <w:sz w:val="26"/>
+          <w:szCs w:val="26"/>
+        </w:rPr>
+        <w:t xml:space="preserve">Giá Hợp đồng:</w:t>
+      </w:r>
+      <w:r>
+        <w:rPr>
+          <w:rFonts w:ascii="Times New Roman" w:cs="Times New Roman" w:eastAsia="Times New Roman" w:hAnsi="Times New Roman"/>
+          <w:sz w:val="26"/>
+          <w:szCs w:val="26"/>
+        </w:rPr>
+        <w:t xml:space="preserve"> là tổng số tiền ghi tại Khoản 9.3 cho việc thực hiện toàn bộ công việc theo Hợp đồng, được điều chỉnh (nếu có) theo quy định của Hợp đồng.</w:t>
+      </w:r>
+    </w:p>
+    <w:p>
+      <w:pPr>
+        <w:spacing w:after="60" w:before="60" w:line="300"/>
+        <w:ind w:firstLine="567"/>
+        <w:jc w:val="both"/>
+      </w:pPr>
+      <w:r>
+        <w:rPr>
+          <w:rFonts w:ascii="Times New Roman" w:cs="Times New Roman" w:eastAsia="Times New Roman" w:hAnsi="Times New Roman"/>
+          <w:sz w:val="26"/>
+          <w:szCs w:val="26"/>
+        </w:rPr>
+        <w:t xml:space="preserve">1.37. </w:t>
+      </w:r>
+      <w:r>
+        <w:rPr>
+          <w:rFonts w:ascii="Times New Roman" w:cs="Times New Roman" w:eastAsia="Times New Roman" w:hAnsi="Times New Roman"/>
+          <w:b/>
+          <w:bCs/>
+          <w:sz w:val="26"/>
+          <w:szCs w:val="26"/>
+        </w:rPr>
+        <w:t xml:space="preserve">Biểu giá Hợp đồng:</w:t>
+      </w:r>
+      <w:r>
+        <w:rPr>
+          <w:rFonts w:ascii="Times New Roman" w:cs="Times New Roman" w:eastAsia="Times New Roman" w:hAnsi="Times New Roman"/>
+          <w:sz w:val="26"/>
+          <w:szCs w:val="26"/>
+        </w:rPr>
+        <w:t xml:space="preserve"> là Biểu 01 [Chi tiết giá hợp đồng], liệt kê hạng mục công việc, khối lượng tạm tính, đơn giá và thành tiền.</w:t>
+      </w:r>
+    </w:p>
+    <w:p>
+      <w:pPr>
+        <w:spacing w:after="60" w:before="60" w:line="300"/>
+        <w:ind w:firstLine="567"/>
+        <w:jc w:val="both"/>
+      </w:pPr>
+      <w:r>
+        <w:rPr>
+          <w:rFonts w:ascii="Times New Roman" w:cs="Times New Roman" w:eastAsia="Times New Roman" w:hAnsi="Times New Roman"/>
+          <w:sz w:val="26"/>
+          <w:szCs w:val="26"/>
+        </w:rPr>
+        <w:t xml:space="preserve">1.38. </w:t>
+      </w:r>
+      <w:r>
+        <w:rPr>
+          <w:rFonts w:ascii="Times New Roman" w:cs="Times New Roman" w:eastAsia="Times New Roman" w:hAnsi="Times New Roman"/>
+          <w:b/>
+          <w:bCs/>
+          <w:sz w:val="26"/>
+          <w:szCs w:val="26"/>
+        </w:rPr>
+        <w:t xml:space="preserve">Giá trị hoàn thành:</w:t>
+      </w:r>
+      <w:r>
+        <w:rPr>
+          <w:rFonts w:ascii="Times New Roman" w:cs="Times New Roman" w:eastAsia="Times New Roman" w:hAnsi="Times New Roman"/>
+          <w:sz w:val="26"/>
+          <w:szCs w:val="26"/>
+        </w:rPr>
+        <w:t xml:space="preserve"> là giá trị khối lượng công việc Bên B đã thực hiện, được nghiệm thu hợp lệ theo Điều 6, tính theo đơn giá Hợp đồng và cách tính khối lượng tại Biểu 02.</w:t>
+      </w:r>
+    </w:p>
+    <w:p>
+      <w:pPr>
+        <w:spacing w:after="60" w:before="60" w:line="300"/>
+        <w:ind w:firstLine="567"/>
+        <w:jc w:val="both"/>
+      </w:pPr>
+      <w:r>
+        <w:rPr>
+          <w:rFonts w:ascii="Times New Roman" w:cs="Times New Roman" w:eastAsia="Times New Roman" w:hAnsi="Times New Roman"/>
+          <w:sz w:val="26"/>
+          <w:szCs w:val="26"/>
+        </w:rPr>
+        <w:t xml:space="preserve">1.39. </w:t>
+      </w:r>
+      <w:r>
+        <w:rPr>
+          <w:rFonts w:ascii="Times New Roman" w:cs="Times New Roman" w:eastAsia="Times New Roman" w:hAnsi="Times New Roman"/>
+          <w:b/>
+          <w:bCs/>
+          <w:sz w:val="26"/>
+          <w:szCs w:val="26"/>
+        </w:rPr>
+        <w:t xml:space="preserve">Công tác chuẩn bị, Biện pháp (trọn gói):</w:t>
+      </w:r>
+      <w:r>
+        <w:rPr>
+          <w:rFonts w:ascii="Times New Roman" w:cs="Times New Roman" w:eastAsia="Times New Roman" w:hAnsi="Times New Roman"/>
+          <w:sz w:val="26"/>
+          <w:szCs w:val="26"/>
+        </w:rPr>
+        <w:t xml:space="preserve"> là các khoản mục chi phí chuẩn bị, huy động, biện pháp thi công, an toàn, công trình tạm được nêu trong Biểu 01 dưới dạng trọn gói, không tính phát sinh, thanh toán theo điểm b Khoản 10.4.</w:t>
+      </w:r>
+    </w:p>
+    <w:p>
+      <w:pPr>
+        <w:spacing w:after="60" w:before="60" w:line="300"/>
+        <w:ind w:firstLine="567"/>
+        <w:jc w:val="both"/>
+      </w:pPr>
+      <w:r>
+        <w:rPr>
+          <w:rFonts w:ascii="Times New Roman" w:cs="Times New Roman" w:eastAsia="Times New Roman" w:hAnsi="Times New Roman"/>
+          <w:sz w:val="26"/>
+          <w:szCs w:val="26"/>
+        </w:rPr>
+        <w:t xml:space="preserve">1.40. </w:t>
+      </w:r>
+      <w:r>
+        <w:rPr>
+          <w:rFonts w:ascii="Times New Roman" w:cs="Times New Roman" w:eastAsia="Times New Roman" w:hAnsi="Times New Roman"/>
+          <w:b/>
+          <w:bCs/>
+          <w:sz w:val="26"/>
+          <w:szCs w:val="26"/>
+        </w:rPr>
+        <w:t xml:space="preserve">Hồ sơ thanh toán hợp lệ:</w:t>
+      </w:r>
+      <w:r>
+        <w:rPr>
+          <w:rFonts w:ascii="Times New Roman" w:cs="Times New Roman" w:eastAsia="Times New Roman" w:hAnsi="Times New Roman"/>
+          <w:sz w:val="26"/>
+          <w:szCs w:val="26"/>
+        </w:rPr>
+        <w:t xml:space="preserve"> là hồ sơ có đầy đủ thành phần theo quy định của Hợp đồng, có đủ chữ ký, xác nhận theo yêu cầu, số liệu chính xác và được Bên A xác nhận là đầy đủ, hợp lệ. Thời hạn xem xét, thanh toán của Bên A chỉ được tính từ ngày nhận được Hồ sơ thanh toán hợp lệ.</w:t>
+      </w:r>
+    </w:p>
+    <w:p>
+      <w:pPr>
+        <w:spacing w:after="60" w:before="60" w:line="300"/>
+        <w:ind w:firstLine="567"/>
+        <w:jc w:val="both"/>
+      </w:pPr>
+      <w:r>
+        <w:rPr>
+          <w:rFonts w:ascii="Times New Roman" w:cs="Times New Roman" w:eastAsia="Times New Roman" w:hAnsi="Times New Roman"/>
+          <w:sz w:val="26"/>
+          <w:szCs w:val="26"/>
+        </w:rPr>
+        <w:t xml:space="preserve">1.41. </w:t>
+      </w:r>
+      <w:r>
+        <w:rPr>
+          <w:rFonts w:ascii="Times New Roman" w:cs="Times New Roman" w:eastAsia="Times New Roman" w:hAnsi="Times New Roman"/>
+          <w:b/>
+          <w:bCs/>
+          <w:sz w:val="26"/>
+          <w:szCs w:val="26"/>
+        </w:rPr>
+        <w:t xml:space="preserve">Bồi thường thiệt hại định trước:</w:t>
+      </w:r>
+      <w:r>
+        <w:rPr>
+          <w:rFonts w:ascii="Times New Roman" w:cs="Times New Roman" w:eastAsia="Times New Roman" w:hAnsi="Times New Roman"/>
+          <w:sz w:val="26"/>
+          <w:szCs w:val="26"/>
+        </w:rPr>
+        <w:t xml:space="preserve"> là khoản tiền Hai Bên thỏa thuận trước theo khoản 2 Điều 86 Luật Xây dựng số 135/2025/QH15 mà Bên B phải trả cho Bên A khi vi phạm, không phụ thuộc việc chứng minh thiệt hại thực tế.</w:t>
+      </w:r>
+    </w:p>
+    <w:p>
+      <w:pPr>
+        <w:keepNext/>
+        <w:spacing w:after="60" w:before="60" w:line="300"/>
+        <w:ind w:firstLine="567"/>
+        <w:jc w:val="both"/>
+      </w:pPr>
+      <w:r>
+        <w:rPr>
+          <w:rFonts w:ascii="Times New Roman" w:cs="Times New Roman" w:eastAsia="Times New Roman" w:hAnsi="Times New Roman"/>
+          <w:b/>
+          <w:bCs/>
+          <w:sz w:val="26"/>
+          <w:szCs w:val="26"/>
+        </w:rPr>
+        <w:t xml:space="preserve">F. Vật tư, thiết bị, chất lượng</w:t>
+      </w:r>
+    </w:p>
+    <w:p>
+      <w:pPr>
+        <w:spacing w:after="60" w:before="60" w:line="300"/>
+        <w:ind w:firstLine="567"/>
+        <w:jc w:val="both"/>
+      </w:pPr>
+      <w:r>
+        <w:rPr>
+          <w:rFonts w:ascii="Times New Roman" w:cs="Times New Roman" w:eastAsia="Times New Roman" w:hAnsi="Times New Roman"/>
+          <w:sz w:val="26"/>
+          <w:szCs w:val="26"/>
+        </w:rPr>
+        <w:t xml:space="preserve">1.42. </w:t>
+      </w:r>
+      <w:r>
+        <w:rPr>
+          <w:rFonts w:ascii="Times New Roman" w:cs="Times New Roman" w:eastAsia="Times New Roman" w:hAnsi="Times New Roman"/>
+          <w:b/>
+          <w:bCs/>
+          <w:sz w:val="26"/>
+          <w:szCs w:val="26"/>
+        </w:rPr>
+        <w:t xml:space="preserve">Vật tư Bên A cấp:</w:t>
+      </w:r>
+      <w:r>
+        <w:rPr>
+          <w:rFonts w:ascii="Times New Roman" w:cs="Times New Roman" w:eastAsia="Times New Roman" w:hAnsi="Times New Roman"/>
+          <w:sz w:val="26"/>
+          <w:szCs w:val="26"/>
+        </w:rPr>
+        <w:t xml:space="preserve"> là các vật tư, vật liệu do Bên A mua và giao cho Bên B để thi công theo Điều 14 và Biểu 07.</w:t>
+      </w:r>
+    </w:p>
+    <w:p>
+      <w:pPr>
+        <w:spacing w:after="60" w:before="60" w:line="300"/>
+        <w:ind w:firstLine="567"/>
+        <w:jc w:val="both"/>
+      </w:pPr>
+      <w:r>
+        <w:rPr>
+          <w:rFonts w:ascii="Times New Roman" w:cs="Times New Roman" w:eastAsia="Times New Roman" w:hAnsi="Times New Roman"/>
+          <w:sz w:val="26"/>
+          <w:szCs w:val="26"/>
+        </w:rPr>
+        <w:t xml:space="preserve">1.43. </w:t>
       </w:r>
       <w:r>
         <w:rPr>
@@ -2156,197 +3173,116 @@
           <w:sz w:val="26"/>
           <w:szCs w:val="26"/>
         </w:rPr>
-        <w:t xml:space="preserve"> là toàn bộ máy móc, phương tiện, thiết bị, hệ ván khuôn, giàn giáo, cây chống, sàn công tác và các phương tiện khác Bên B phải có để thi công, hoàn thành Hạng mục công trình và sửa chữa mọi sai sót (nếu có).</w:t>
-      </w:r>
-    </w:p>
-    <w:p>
-      <w:pPr>
-        <w:spacing w:after="60" w:before="60" w:line="300"/>
-        <w:ind w:firstLine="567"/>
-        <w:jc w:val="both"/>
-      </w:pPr>
-      <w:r>
-        <w:rPr>
-          <w:rFonts w:ascii="Times New Roman" w:cs="Times New Roman" w:eastAsia="Times New Roman" w:hAnsi="Times New Roman"/>
-          <w:sz w:val="26"/>
-          <w:szCs w:val="26"/>
-        </w:rPr>
-        <w:t xml:space="preserve">1.17. </w:t>
-      </w:r>
-      <w:r>
-        <w:rPr>
-          <w:rFonts w:ascii="Times New Roman" w:cs="Times New Roman" w:eastAsia="Times New Roman" w:hAnsi="Times New Roman"/>
-          <w:b/>
-          <w:bCs/>
-          <w:sz w:val="26"/>
-          <w:szCs w:val="26"/>
-        </w:rPr>
-        <w:t xml:space="preserve">Công trình:</w:t>
-      </w:r>
-      <w:r>
-        <w:rPr>
-          <w:rFonts w:ascii="Times New Roman" w:cs="Times New Roman" w:eastAsia="Times New Roman" w:hAnsi="Times New Roman"/>
-          <w:sz w:val="26"/>
-          <w:szCs w:val="26"/>
-        </w:rPr>
-        <w:t xml:space="preserve"> Nhà ở cho lực lượng vũ trang Công an nhân dân tại ô đất C3-ODK3 và C3-ODK4 thuộc phân khu đô thị H2-4, Phường Yên Sở, Thành phố Hà Nội.</w:t>
-      </w:r>
-    </w:p>
-    <w:p>
-      <w:pPr>
-        <w:spacing w:after="60" w:before="60" w:line="300"/>
-        <w:ind w:firstLine="567"/>
-        <w:jc w:val="both"/>
-      </w:pPr>
-      <w:r>
-        <w:rPr>
-          <w:rFonts w:ascii="Times New Roman" w:cs="Times New Roman" w:eastAsia="Times New Roman" w:hAnsi="Times New Roman"/>
-          <w:sz w:val="26"/>
-          <w:szCs w:val="26"/>
-        </w:rPr>
-        <w:t xml:space="preserve">1.18. </w:t>
-      </w:r>
-      <w:r>
-        <w:rPr>
-          <w:rFonts w:ascii="Times New Roman" w:cs="Times New Roman" w:eastAsia="Times New Roman" w:hAnsi="Times New Roman"/>
-          <w:b/>
-          <w:bCs/>
-          <w:sz w:val="26"/>
-          <w:szCs w:val="26"/>
-        </w:rPr>
-        <w:t xml:space="preserve">Hạng mục công trình:</w:t>
-      </w:r>
-      <w:r>
-        <w:rPr>
-          <w:rFonts w:ascii="Times New Roman" w:cs="Times New Roman" w:eastAsia="Times New Roman" w:hAnsi="Times New Roman"/>
-          <w:sz w:val="26"/>
-          <w:szCs w:val="26"/>
-        </w:rPr>
-        <w:t xml:space="preserve"> Thi công Gói thầu P.001 – Thi công kết cấu phần thân và hoàn thiện ướt phần thân (chống thấm, xây, trát, ốp, lát, sơn, bả,..) cho khối nhà ở xã hội CT1.2 và CT2 (CT2.1, CT2.2 và CT2.3).</w:t>
-      </w:r>
-    </w:p>
-    <w:p>
-      <w:pPr>
-        <w:spacing w:after="60" w:before="60" w:line="300"/>
-        <w:ind w:firstLine="567"/>
-        <w:jc w:val="both"/>
-      </w:pPr>
-      <w:r>
-        <w:rPr>
-          <w:rFonts w:ascii="Times New Roman" w:cs="Times New Roman" w:eastAsia="Times New Roman" w:hAnsi="Times New Roman"/>
-          <w:sz w:val="26"/>
-          <w:szCs w:val="26"/>
-        </w:rPr>
-        <w:t xml:space="preserve">1.19. </w:t>
-      </w:r>
-      <w:r>
-        <w:rPr>
-          <w:rFonts w:ascii="Times New Roman" w:cs="Times New Roman" w:eastAsia="Times New Roman" w:hAnsi="Times New Roman"/>
-          <w:b/>
-          <w:bCs/>
-          <w:sz w:val="26"/>
-          <w:szCs w:val="26"/>
-        </w:rPr>
-        <w:t xml:space="preserve">Phần thân:</w:t>
-      </w:r>
-      <w:r>
-        <w:rPr>
-          <w:rFonts w:ascii="Times New Roman" w:cs="Times New Roman" w:eastAsia="Times New Roman" w:hAnsi="Times New Roman"/>
-          <w:sz w:val="26"/>
-          <w:szCs w:val="26"/>
-        </w:rPr>
-        <w:t xml:space="preserve"> là toàn bộ các công việc kết cấu bê tông cốt thép từ trên cao độ ±0.00 (sau khi hoàn thành bê tông sàn tầng 1) đến hết kết cấu mái, tum thang, bể nước mái (cột, vách, lõi, dầm, sàn, cầu thang, lanh tô, giằng tường, ô văng, sê nô…) và công tác hoàn thiện ướt các khu vực từ cao độ ±0.00 trở lên (chống thấm, xây, trát, ốp, lát, sơn, bả…) theo Hồ sơ thiết kế được duyệt. Ranh giới chi tiết theo Biểu 02 và Biểu 03. Công tác đất, cừ, văng chống, kết cấu phần ngầm và hoàn thiện ướt phần ngầm không thuộc phạm vi Hợp đồng này.</w:t>
-      </w:r>
-    </w:p>
-    <w:p>
-      <w:pPr>
-        <w:spacing w:after="60" w:before="60" w:line="300"/>
-        <w:ind w:firstLine="567"/>
-        <w:jc w:val="both"/>
-      </w:pPr>
-      <w:r>
-        <w:rPr>
-          <w:rFonts w:ascii="Times New Roman" w:cs="Times New Roman" w:eastAsia="Times New Roman" w:hAnsi="Times New Roman"/>
-          <w:sz w:val="26"/>
-          <w:szCs w:val="26"/>
-        </w:rPr>
-        <w:t xml:space="preserve">1.20. </w:t>
-      </w:r>
-      <w:r>
-        <w:rPr>
-          <w:rFonts w:ascii="Times New Roman" w:cs="Times New Roman" w:eastAsia="Times New Roman" w:hAnsi="Times New Roman"/>
-          <w:b/>
-          <w:bCs/>
-          <w:sz w:val="26"/>
-          <w:szCs w:val="26"/>
-        </w:rPr>
-        <w:t xml:space="preserve">Chu kỳ sàn:</w:t>
-      </w:r>
-      <w:r>
-        <w:rPr>
-          <w:rFonts w:ascii="Times New Roman" w:cs="Times New Roman" w:eastAsia="Times New Roman" w:hAnsi="Times New Roman"/>
-          <w:sz w:val="26"/>
-          <w:szCs w:val="26"/>
-        </w:rPr>
-        <w:t xml:space="preserve"> là khoảng thời gian tính từ ngày hoàn thành đổ bê tông sàn tầng dưới đến ngày hoàn thành đổ bê tông sàn tầng liền kề phía trên.</w:t>
-      </w:r>
-    </w:p>
-    <w:p>
-      <w:pPr>
-        <w:spacing w:after="60" w:before="60" w:line="300"/>
-        <w:ind w:firstLine="567"/>
-        <w:jc w:val="both"/>
-      </w:pPr>
-      <w:r>
-        <w:rPr>
-          <w:rFonts w:ascii="Times New Roman" w:cs="Times New Roman" w:eastAsia="Times New Roman" w:hAnsi="Times New Roman"/>
-          <w:sz w:val="26"/>
-          <w:szCs w:val="26"/>
-        </w:rPr>
-        <w:t xml:space="preserve">1.21. </w:t>
-      </w:r>
-      <w:r>
-        <w:rPr>
-          <w:rFonts w:ascii="Times New Roman" w:cs="Times New Roman" w:eastAsia="Times New Roman" w:hAnsi="Times New Roman"/>
-          <w:b/>
-          <w:bCs/>
-          <w:sz w:val="26"/>
-          <w:szCs w:val="26"/>
-        </w:rPr>
-        <w:t xml:space="preserve">Hồ sơ hoàn công:</w:t>
-      </w:r>
-      <w:r>
-        <w:rPr>
-          <w:rFonts w:ascii="Times New Roman" w:cs="Times New Roman" w:eastAsia="Times New Roman" w:hAnsi="Times New Roman"/>
-          <w:sz w:val="26"/>
-          <w:szCs w:val="26"/>
-        </w:rPr>
-        <w:t xml:space="preserve"> là tập hợp các hồ sơ, tài liệu có liên quan tới quá trình thi công xây dựng Hạng mục công trình được lập theo quy định của pháp luật về xây dựng, Hợp đồng thầu chính, yêu cầu của Chủ đầu tư và cơ quan có thẩm quyền.</w:t>
-      </w:r>
-    </w:p>
-    <w:p>
-      <w:pPr>
-        <w:spacing w:after="60" w:before="60" w:line="300"/>
-        <w:ind w:firstLine="567"/>
-        <w:jc w:val="both"/>
-      </w:pPr>
-      <w:r>
-        <w:rPr>
-          <w:rFonts w:ascii="Times New Roman" w:cs="Times New Roman" w:eastAsia="Times New Roman" w:hAnsi="Times New Roman"/>
-          <w:sz w:val="26"/>
-          <w:szCs w:val="26"/>
-        </w:rPr>
-        <w:t xml:space="preserve">1.22. </w:t>
-      </w:r>
-      <w:r>
-        <w:rPr>
-          <w:rFonts w:ascii="Times New Roman" w:cs="Times New Roman" w:eastAsia="Times New Roman" w:hAnsi="Times New Roman"/>
-          <w:b/>
-          <w:bCs/>
-          <w:sz w:val="26"/>
-          <w:szCs w:val="26"/>
-        </w:rPr>
-        <w:t xml:space="preserve">Rủi ro và bất khả kháng:</w:t>
+        <w:t xml:space="preserve"> là toàn bộ máy móc, phương tiện, thiết bị, hệ ván khuôn, giàn giáo, cây chống, sàn công tác và các phương tiện khác Bên B phải có để thi công, hoàn thành Hạng mục công trình và sửa chữa mọi Sai sót.</w:t>
+      </w:r>
+    </w:p>
+    <w:p>
+      <w:pPr>
+        <w:spacing w:after="60" w:before="60" w:line="300"/>
+        <w:ind w:firstLine="567"/>
+        <w:jc w:val="both"/>
+      </w:pPr>
+      <w:r>
+        <w:rPr>
+          <w:rFonts w:ascii="Times New Roman" w:cs="Times New Roman" w:eastAsia="Times New Roman" w:hAnsi="Times New Roman"/>
+          <w:sz w:val="26"/>
+          <w:szCs w:val="26"/>
+        </w:rPr>
+        <w:t xml:space="preserve">1.44. </w:t>
+      </w:r>
+      <w:r>
+        <w:rPr>
+          <w:rFonts w:ascii="Times New Roman" w:cs="Times New Roman" w:eastAsia="Times New Roman" w:hAnsi="Times New Roman"/>
+          <w:b/>
+          <w:bCs/>
+          <w:sz w:val="26"/>
+          <w:szCs w:val="26"/>
+        </w:rPr>
+        <w:t xml:space="preserve">Thiết bị nâng hạ dùng chung:</w:t>
+      </w:r>
+      <w:r>
+        <w:rPr>
+          <w:rFonts w:ascii="Times New Roman" w:cs="Times New Roman" w:eastAsia="Times New Roman" w:hAnsi="Times New Roman"/>
+          <w:sz w:val="26"/>
+          <w:szCs w:val="26"/>
+        </w:rPr>
+        <w:t xml:space="preserve"> là cẩu tháp, vận thăng và các thiết bị nâng hạ do Bên A bố trí để các nhà thầu trên Công trường cùng sử dụng theo lịch phân bổ của Bên A (nếu có theo Biểu 03).</w:t>
+      </w:r>
+    </w:p>
+    <w:p>
+      <w:pPr>
+        <w:spacing w:after="60" w:before="60" w:line="300"/>
+        <w:ind w:firstLine="567"/>
+        <w:jc w:val="both"/>
+      </w:pPr>
+      <w:r>
+        <w:rPr>
+          <w:rFonts w:ascii="Times New Roman" w:cs="Times New Roman" w:eastAsia="Times New Roman" w:hAnsi="Times New Roman"/>
+          <w:sz w:val="26"/>
+          <w:szCs w:val="26"/>
+        </w:rPr>
+        <w:t xml:space="preserve">1.45. </w:t>
+      </w:r>
+      <w:r>
+        <w:rPr>
+          <w:rFonts w:ascii="Times New Roman" w:cs="Times New Roman" w:eastAsia="Times New Roman" w:hAnsi="Times New Roman"/>
+          <w:b/>
+          <w:bCs/>
+          <w:sz w:val="26"/>
+          <w:szCs w:val="26"/>
+        </w:rPr>
+        <w:t xml:space="preserve">Sai sót:</w:t>
+      </w:r>
+      <w:r>
+        <w:rPr>
+          <w:rFonts w:ascii="Times New Roman" w:cs="Times New Roman" w:eastAsia="Times New Roman" w:hAnsi="Times New Roman"/>
+          <w:sz w:val="26"/>
+          <w:szCs w:val="26"/>
+        </w:rPr>
+        <w:t xml:space="preserve"> là bất kỳ phần công việc, vật liệu, sản phẩm nào không phù hợp với Hợp đồng, Hồ sơ thiết kế, Chỉ dẫn kỹ thuật, quy chuẩn, tiêu chuẩn, Mẫu đã duyệt, hoặc có khuyết tật, hư hỏng do Bên B gây ra, dù phát hiện trước hay sau khi nghiệm thu.</w:t>
+      </w:r>
+    </w:p>
+    <w:p>
+      <w:pPr>
+        <w:keepNext/>
+        <w:spacing w:after="60" w:before="60" w:line="300"/>
+        <w:ind w:firstLine="567"/>
+        <w:jc w:val="both"/>
+      </w:pPr>
+      <w:r>
+        <w:rPr>
+          <w:rFonts w:ascii="Times New Roman" w:cs="Times New Roman" w:eastAsia="Times New Roman" w:hAnsi="Times New Roman"/>
+          <w:b/>
+          <w:bCs/>
+          <w:sz w:val="26"/>
+          <w:szCs w:val="26"/>
+        </w:rPr>
+        <w:t xml:space="preserve">G. Các thuật ngữ khác</w:t>
+      </w:r>
+    </w:p>
+    <w:p>
+      <w:pPr>
+        <w:spacing w:after="60" w:before="60" w:line="300"/>
+        <w:ind w:firstLine="567"/>
+        <w:jc w:val="both"/>
+      </w:pPr>
+      <w:r>
+        <w:rPr>
+          <w:rFonts w:ascii="Times New Roman" w:cs="Times New Roman" w:eastAsia="Times New Roman" w:hAnsi="Times New Roman"/>
+          <w:sz w:val="26"/>
+          <w:szCs w:val="26"/>
+        </w:rPr>
+        <w:t xml:space="preserve">1.46. </w:t>
+      </w:r>
+      <w:r>
+        <w:rPr>
+          <w:rFonts w:ascii="Times New Roman" w:cs="Times New Roman" w:eastAsia="Times New Roman" w:hAnsi="Times New Roman"/>
+          <w:b/>
+          <w:bCs/>
+          <w:sz w:val="26"/>
+          <w:szCs w:val="26"/>
+        </w:rPr>
+        <w:t xml:space="preserve">Bất khả kháng:</w:t>
       </w:r>
       <w:r>
         <w:rPr>
@@ -2369,7 +3305,7 @@
           <w:sz w:val="26"/>
           <w:szCs w:val="26"/>
         </w:rPr>
-        <w:t xml:space="preserve">1.23. </w:t>
+        <w:t xml:space="preserve">1.47. </w:t>
       </w:r>
       <w:r>
         <w:rPr>
@@ -2402,40 +3338,7 @@
           <w:sz w:val="26"/>
           <w:szCs w:val="26"/>
         </w:rPr>
-        <w:t xml:space="preserve">1.24. </w:t>
-      </w:r>
-      <w:r>
-        <w:rPr>
-          <w:rFonts w:ascii="Times New Roman" w:cs="Times New Roman" w:eastAsia="Times New Roman" w:hAnsi="Times New Roman"/>
-          <w:b/>
-          <w:bCs/>
-          <w:sz w:val="26"/>
-          <w:szCs w:val="26"/>
-        </w:rPr>
-        <w:t xml:space="preserve">Công trường:</w:t>
-      </w:r>
-      <w:r>
-        <w:rPr>
-          <w:rFonts w:ascii="Times New Roman" w:cs="Times New Roman" w:eastAsia="Times New Roman" w:hAnsi="Times New Roman"/>
-          <w:sz w:val="26"/>
-          <w:szCs w:val="26"/>
-        </w:rPr>
-        <w:t xml:space="preserve"> là địa điểm Chủ đầu tư giao cho Bên A để thi công Công trình cũng như bất kỳ địa điểm nào khác được quy định trong Hợp đồng.</w:t>
-      </w:r>
-    </w:p>
-    <w:p>
-      <w:pPr>
-        <w:spacing w:after="60" w:before="60" w:line="300"/>
-        <w:ind w:firstLine="567"/>
-        <w:jc w:val="both"/>
-      </w:pPr>
-      <w:r>
-        <w:rPr>
-          <w:rFonts w:ascii="Times New Roman" w:cs="Times New Roman" w:eastAsia="Times New Roman" w:hAnsi="Times New Roman"/>
-          <w:sz w:val="26"/>
-          <w:szCs w:val="26"/>
-        </w:rPr>
-        <w:t xml:space="preserve">1.25. Các từ ngữ khác chưa được định nghĩa tại Điều này được hiểu theo định nghĩa trong Hợp đồng thầu chính, quy định của Luật Xây dựng và các văn bản hướng dẫn thi hành.</w:t>
+        <w:t xml:space="preserve">1.48. Các từ ngữ khác chưa được định nghĩa tại Điều này được hiểu theo định nghĩa trong Hợp đồng thầu chính, quy định của Luật Xây dựng và các văn bản hướng dẫn thi hành. Trường hợp có cách hiểu khác nhau, cách hiểu theo Hợp đồng thầu chính được ưu tiên áp dụng.</w:t>
       </w:r>
     </w:p>
     <w:p>

</xml_diff>